<commit_message>
Propagate conditional interpretations and synchronize reviewed documents
Close the six round-six findings across source text, table cells, captions and generated article/supplement. Preserve scientific numbers and figures, correct unsupported references, and keep headings with content while repeating article table headers.

Record 25 final assertions, independent helper regressions, original-detail inspection of all 413 pages and hash-gated PDF publication. Preserve review history and explicitly retain historical provenance, Lean refinement and publication-input limits.
</commit_message>
<xml_diff>
--- a/article/Pf8_Ghana_article.docx
+++ b/article/Pf8_Ghana_article.docx
@@ -5,6 +5,8 @@
     <w:p>
       <w:pPr>
         <w:pStyle w:val="Heading1"/>
+        <w:keepNext/>
+        <w:keepLines/>
         <w:spacing w:after="240" w:line="276"/>
       </w:pPr>
       <w:r>
@@ -32,6 +34,8 @@
     <w:p>
       <w:pPr>
         <w:pStyle w:val="Heading1"/>
+        <w:keepNext/>
+        <w:keepLines/>
         <w:spacing w:after="160" w:line="276"/>
       </w:pPr>
       <w:r>
@@ -198,6 +202,8 @@
     <w:p>
       <w:pPr>
         <w:pStyle w:val="Heading1"/>
+        <w:keepNext/>
+        <w:keepLines/>
         <w:spacing w:after="160" w:line="276"/>
       </w:pPr>
       <w:r>
@@ -232,6 +238,8 @@
     <w:p>
       <w:pPr>
         <w:pStyle w:val="Heading1"/>
+        <w:keepNext/>
+        <w:keepLines/>
         <w:spacing w:after="160" w:line="276"/>
       </w:pPr>
       <w:r>
@@ -269,7 +277,7 @@
         <w:spacing w:after="160" w:line="276"/>
       </w:pPr>
       <w:r>
-        <w:t xml:space="preserve">Population structure matters for resistance surveillance because surveillance is almost always local while policy is national. A marker frequency is measured in isolates from a handful of sentinel sites and then used to describe the country. The estimate generalises only if parasites are exchanged freely enough between zones that allele frequencies are effectively shared. If, instead, zones are differentiated, a national frequency built from whichever zone happens to have been sequenced most heavily is biased, and a resistance allele rising in one ecological setting can be diluted to invisibility in a pooled national figure. The magnitude of structure therefore sets the spatial resolution at which surveillance has to be designed, and it needs to be quantified with interval estimates rather than asserted, because very low differentiation and no differentiation have different operational consequences. Quantification also requires care in interpretation: an F</w:t>
+        <w:t xml:space="preserve">Population structure matters for resistance surveillance because surveillance is almost always local while policy is national. A marker frequency is measured in isolates from a handful of sentinel sites and then used to describe the country. Whether a local estimate represents the country depends on the geographic distribution of the marker and the sampling design; low common-variant differentiation alone does not establish that representativeness. If, instead, zones are differentiated, a national frequency built from whichever zone happens to have been sequenced most heavily is biased, and a resistance allele rising in one ecological setting can be diluted to invisibility in a pooled national figure. The magnitude of structure therefore sets the spatial resolution at which surveillance has to be designed, and it needs to be quantified with interval estimates rather than asserted, because very low differentiation and no differentiation have different operational consequences. Quantification also requires care in interpretation: an F</w:t>
       </w:r>
       <w:r>
         <w:rPr>
@@ -427,6 +435,8 @@
     <w:p>
       <w:pPr>
         <w:pStyle w:val="Heading1"/>
+        <w:keepNext/>
+        <w:keepLines/>
         <w:spacing w:after="160" w:line="276"/>
       </w:pPr>
       <w:r>
@@ -436,6 +446,8 @@
     <w:p>
       <w:pPr>
         <w:pStyle w:val="Heading2"/>
+        <w:keepNext/>
+        <w:keepLines/>
         <w:spacing w:after="120" w:line="276"/>
       </w:pPr>
       <w:r>
@@ -530,6 +542,8 @@
     <w:p>
       <w:pPr>
         <w:pStyle w:val="Heading2"/>
+        <w:keepNext/>
+        <w:keepLines/>
         <w:spacing w:after="120" w:line="276"/>
       </w:pPr>
       <w:r>
@@ -572,6 +586,8 @@
     <w:p>
       <w:pPr>
         <w:pStyle w:val="Heading2"/>
+        <w:keepNext/>
+        <w:keepLines/>
         <w:spacing w:after="120" w:line="276"/>
       </w:pPr>
       <w:r>
@@ -624,6 +640,8 @@
     <w:p>
       <w:pPr>
         <w:pStyle w:val="Heading2"/>
+        <w:keepNext/>
+        <w:keepLines/>
         <w:spacing w:after="120" w:line="276"/>
       </w:pPr>
       <w:r>
@@ -649,6 +667,8 @@
     <w:p>
       <w:pPr>
         <w:pStyle w:val="Heading2"/>
+        <w:keepNext/>
+        <w:keepLines/>
         <w:spacing w:after="120" w:line="276"/>
       </w:pPr>
       <w:r>
@@ -674,6 +694,8 @@
     <w:p>
       <w:pPr>
         <w:pStyle w:val="Heading2"/>
+        <w:keepNext/>
+        <w:keepLines/>
         <w:spacing w:after="120" w:line="276"/>
       </w:pPr>
       <w:r>
@@ -835,6 +857,8 @@
     <w:p>
       <w:pPr>
         <w:pStyle w:val="Heading2"/>
+        <w:keepNext/>
+        <w:keepLines/>
         <w:spacing w:after="120" w:line="276"/>
       </w:pPr>
       <w:r>
@@ -860,6 +884,8 @@
     <w:p>
       <w:pPr>
         <w:pStyle w:val="Heading1"/>
+        <w:keepNext/>
+        <w:keepLines/>
         <w:spacing w:after="160" w:line="276"/>
       </w:pPr>
       <w:r>
@@ -869,6 +895,8 @@
     <w:p>
       <w:pPr>
         <w:pStyle w:val="Heading2"/>
+        <w:keepNext/>
+        <w:keepLines/>
         <w:spacing w:after="120" w:line="276"/>
       </w:pPr>
       <w:r>
@@ -1008,6 +1036,9 @@
         <w:gridCol w:w="1180"/>
       </w:tblGrid>
       <w:tr>
+        <w:trPr>
+          <w:tblHeader/>
+        </w:trPr>
         <w:tc>
           <w:tcPr>
             <w:tcW w:type="dxa" w:w="1450"/>
@@ -1861,6 +1892,8 @@
     <w:p>
       <w:pPr>
         <w:pStyle w:val="Heading2"/>
+        <w:keepNext/>
+        <w:keepLines/>
         <w:spacing w:after="120" w:line="276"/>
       </w:pPr>
       <w:r>
@@ -1938,6 +1971,8 @@
     <w:p>
       <w:pPr>
         <w:pStyle w:val="Heading2"/>
+        <w:keepNext/>
+        <w:keepLines/>
         <w:spacing w:after="120" w:line="276"/>
       </w:pPr>
       <w:r>
@@ -2016,6 +2051,9 @@
         <w:gridCol w:w="1100"/>
       </w:tblGrid>
       <w:tr>
+        <w:trPr>
+          <w:tblHeader/>
+        </w:trPr>
         <w:tc>
           <w:tcPr>
             <w:tcW w:type="dxa" w:w="3100"/>
@@ -3123,6 +3161,9 @@
         <w:gridCol w:w="900"/>
       </w:tblGrid>
       <w:tr>
+        <w:trPr>
+          <w:tblHeader/>
+        </w:trPr>
         <w:tc>
           <w:tcPr>
             <w:tcW w:type="dxa" w:w="2600"/>
@@ -4356,6 +4397,8 @@
     <w:p>
       <w:pPr>
         <w:pStyle w:val="Heading2"/>
+        <w:keepNext/>
+        <w:keepLines/>
         <w:spacing w:after="120" w:line="276"/>
       </w:pPr>
       <w:r>
@@ -4381,6 +4424,8 @@
     <w:p>
       <w:pPr>
         <w:pStyle w:val="Heading2"/>
+        <w:keepNext/>
+        <w:keepLines/>
         <w:spacing w:after="120" w:line="276"/>
       </w:pPr>
       <w:r>
@@ -4424,6 +4469,8 @@
     <w:p>
       <w:pPr>
         <w:pStyle w:val="Heading2"/>
+        <w:keepNext/>
+        <w:keepLines/>
         <w:spacing w:after="120" w:line="276"/>
       </w:pPr>
       <w:r>
@@ -4449,6 +4496,8 @@
     <w:p>
       <w:pPr>
         <w:pStyle w:val="Heading2"/>
+        <w:keepNext/>
+        <w:keepLines/>
         <w:spacing w:after="120" w:line="276"/>
       </w:pPr>
       <w:r>
@@ -4612,6 +4661,8 @@
     <w:p>
       <w:pPr>
         <w:pStyle w:val="Heading2"/>
+        <w:keepNext/>
+        <w:keepLines/>
         <w:spacing w:after="120" w:line="276"/>
       </w:pPr>
       <w:r>
@@ -4696,6 +4747,9 @@
         <w:gridCol w:w="1200"/>
       </w:tblGrid>
       <w:tr>
+        <w:trPr>
+          <w:tblHeader/>
+        </w:trPr>
         <w:tc>
           <w:tcPr>
             <w:tcW w:type="dxa" w:w="2200"/>
@@ -8806,6 +8860,8 @@
     <w:p>
       <w:pPr>
         <w:pStyle w:val="Heading2"/>
+        <w:keepNext/>
+        <w:keepLines/>
         <w:spacing w:after="120" w:line="276"/>
       </w:pPr>
       <w:r>
@@ -8850,6 +8906,8 @@
     <w:p>
       <w:pPr>
         <w:pStyle w:val="Heading2"/>
+        <w:keepNext/>
+        <w:keepLines/>
         <w:spacing w:after="120" w:line="276"/>
       </w:pPr>
       <w:r>
@@ -8891,6 +8949,8 @@
     <w:p>
       <w:pPr>
         <w:pStyle w:val="Heading2"/>
+        <w:keepNext/>
+        <w:keepLines/>
         <w:spacing w:after="120" w:line="276"/>
       </w:pPr>
       <w:r>
@@ -8918,6 +8978,8 @@
     <w:p>
       <w:pPr>
         <w:pStyle w:val="Heading2"/>
+        <w:keepNext/>
+        <w:keepLines/>
         <w:spacing w:after="120" w:line="276"/>
       </w:pPr>
       <w:r>
@@ -8953,6 +9015,8 @@
     <w:p>
       <w:pPr>
         <w:pStyle w:val="Heading2"/>
+        <w:keepNext/>
+        <w:keepLines/>
         <w:spacing w:after="120" w:line="276"/>
       </w:pPr>
       <w:r>
@@ -8990,6 +9054,8 @@
     <w:p>
       <w:pPr>
         <w:pStyle w:val="Heading1"/>
+        <w:keepNext/>
+        <w:keepLines/>
         <w:spacing w:after="160" w:line="276"/>
       </w:pPr>
       <w:r>
@@ -8999,6 +9065,8 @@
     <w:p>
       <w:pPr>
         <w:pStyle w:val="Heading2"/>
+        <w:keepNext/>
+        <w:keepLines/>
         <w:spacing w:after="120" w:line="276"/>
       </w:pPr>
       <w:r>
@@ -9068,6 +9136,8 @@
     <w:p>
       <w:pPr>
         <w:pStyle w:val="Heading2"/>
+        <w:keepNext/>
+        <w:keepLines/>
         <w:spacing w:after="120" w:line="276"/>
       </w:pPr>
       <w:r>
@@ -9129,10 +9199,12 @@
     <w:p>
       <w:pPr>
         <w:pStyle w:val="Heading2"/>
+        <w:keepNext/>
+        <w:keepLines/>
         <w:spacing w:after="120" w:line="276"/>
       </w:pPr>
       <w:r>
-        <w:t xml:space="preserve">Resistance markers vary geographically where neutral structure does not</w:t>
+        <w:t xml:space="preserve">Resistance markers vary geographically alongside very low common-variant differentiation</w:t>
       </w:r>
     </w:p>
     <w:p>
@@ -9169,7 +9241,7 @@
         <w:t xml:space="preserve">ST</w:t>
       </w:r>
       <w:r>
-        <w:t xml:space="preserve"> averages drift and gene flow over thousands of retained variants; selection acts on single loci, and the pressures that drive resistance markers — treatment policy, drug deployment history, treatment-seeking behaviour, transmission intensity — vary at sub-national scale. A locus under local selection can therefore move much further and much faster than the genome-wide average, and a very low genome-wide estimate places no constraint on how far apart marker frequencies can be.</w:t>
+        <w:t xml:space="preserve"> summarises among-group allele-frequency differences across the retained variants rather than separately estimating drift or gene flow; selection can affect individual loci, and the pressures that drive resistance markers — treatment policy, drug deployment history, treatment-seeking behaviour, transmission intensity — vary at sub-national scale. A locus under local selection can therefore move much further and much faster than the genome-wide average, and a very low genome-wide estimate places no constraint on how far apart marker frequencies can be.</w:t>
       </w:r>
     </w:p>
     <w:p>
@@ -9192,6 +9264,8 @@
     <w:p>
       <w:pPr>
         <w:pStyle w:val="Heading2"/>
+        <w:keepNext/>
+        <w:keepLines/>
         <w:spacing w:after="120" w:line="276"/>
       </w:pPr>
       <w:r>
@@ -9245,6 +9319,8 @@
     <w:p>
       <w:pPr>
         <w:pStyle w:val="Heading2"/>
+        <w:keepNext/>
+        <w:keepLines/>
         <w:spacing w:after="120" w:line="276"/>
       </w:pPr>
       <w:r>
@@ -9290,6 +9366,8 @@
     <w:p>
       <w:pPr>
         <w:pStyle w:val="Heading2"/>
+        <w:keepNext/>
+        <w:keepLines/>
         <w:spacing w:after="120" w:line="276"/>
       </w:pPr>
       <w:r>
@@ -9375,6 +9453,8 @@
     <w:p>
       <w:pPr>
         <w:pStyle w:val="Heading1"/>
+        <w:keepNext/>
+        <w:keepLines/>
         <w:spacing w:after="160" w:line="276"/>
       </w:pPr>
       <w:r>
@@ -9414,7 +9494,7 @@
         <w:t xml:space="preserve">ST</w:t>
       </w:r>
       <w:r>
-        <w:t xml:space="preserve"> remained within 0.00204-0.00255 across six combinations of within-host complexity and minor allele frequency thresholds (Table 4), so the signal is a property of the retained common variants rather than of one threshold choice. Ordination recovered no zone structure, every silhouette coefficient being negative (Fig. 2).</w:t>
+        <w:t xml:space="preserve"> remained within 0.00204-0.00255 across six combinations of within-host complexity and minor allele frequency thresholds (Table 4), so the signal is a property of the retained common variants rather than of one threshold choice. Zones did not separate in the ordinations, every silhouette coefficient being negative (Fig. 2).</w:t>
       </w:r>
     </w:p>
     <w:p>
@@ -9474,6 +9554,8 @@
     <w:p>
       <w:pPr>
         <w:pStyle w:val="Heading1"/>
+        <w:keepNext/>
+        <w:keepLines/>
         <w:spacing w:after="160" w:line="276"/>
       </w:pPr>
       <w:r>
@@ -9573,6 +9655,8 @@
     <w:p>
       <w:pPr>
         <w:pStyle w:val="Heading1"/>
+        <w:keepNext/>
+        <w:keepLines/>
         <w:spacing w:after="160" w:line="276"/>
       </w:pPr>
       <w:r>
@@ -11056,6 +11140,8 @@
     <w:next w:val="Normal"/>
     <w:qFormat/>
     <w:pPr>
+      <w:keepNext/>
+      <w:keepLines/>
       <w:spacing w:after="160" w:before="320"/>
       <w:outlineLvl w:val="0"/>
     </w:pPr>
@@ -11074,6 +11160,8 @@
     <w:next w:val="Normal"/>
     <w:qFormat/>
     <w:pPr>
+      <w:keepNext/>
+      <w:keepLines/>
       <w:spacing w:after="120" w:before="260"/>
       <w:outlineLvl w:val="1"/>
     </w:pPr>
@@ -11092,6 +11180,8 @@
     <w:next w:val="Normal"/>
     <w:qFormat/>
     <w:pPr>
+      <w:keepNext/>
+      <w:keepLines/>
       <w:spacing w:after="100" w:before="200"/>
       <w:outlineLvl w:val="2"/>
     </w:pPr>

</xml_diff>

<commit_message>
Apply initial confirmed wording, metadata and article-order corrections before broader page review
</commit_message>
<xml_diff>
--- a/article/Pf8_Ghana_article.docx
+++ b/article/Pf8_Ghana_article.docx
@@ -339,7 +339,7 @@
         <w:t xml:space="preserve">ST</w:t>
       </w:r>
       <w:r>
-        <w:t xml:space="preserve"> with block-jackknife confidence intervals and examined alongside ordination of the published genotype distances (Fig. 2, Table 2)? Second, does differentiation scale with geographic distance between populations, and is any such relationship robust to the thresholds and spatial units used to define the analysis set (Table 4)? Third, what are the frequencies, in isolates collected between 2009 and 2021, of validated, candidate and potential resistance markers across the nine genes </w:t>
+        <w:t xml:space="preserve"> with block-jackknife confidence intervals and examined alongside ordination of the published genotype distances (Fig. 2, Table 2)? Second, does differentiation scale with geographic distance between populations, and is any such relationship robust to the thresholds and spatial units used to define the analysis set? Third, what are the frequencies, in isolates collected between 2009 and 2021, of validated, candidate and potential resistance markers across the nine genes </w:t>
       </w:r>
       <w:r>
         <w:rPr>
@@ -2043,1121 +2043,11 @@
         </w:tblBorders>
       </w:tblPr>
       <w:tblGrid>
-        <w:gridCol w:w="3100"/>
-        <w:gridCol w:w="600"/>
-        <w:gridCol w:w="600"/>
-        <w:gridCol w:w="1000"/>
-        <w:gridCol w:w="1900"/>
-        <w:gridCol w:w="1100"/>
-      </w:tblGrid>
-      <w:tr>
-        <w:trPr>
-          <w:tblHeader/>
-        </w:trPr>
-        <w:tc>
-          <w:tcPr>
-            <w:tcW w:type="dxa" w:w="3100"/>
-            <w:tcMar>
-              <w:top w:type="dxa" w:w="60"/>
-              <w:left w:type="dxa" w:w="90"/>
-              <w:bottom w:type="dxa" w:w="60"/>
-              <w:right w:type="dxa" w:w="90"/>
-            </w:tcMar>
-          </w:tcPr>
-          <w:p>
-            <w:pPr>
-              <w:spacing w:after="0" w:line="240"/>
-            </w:pPr>
-            <w:r>
-              <w:rPr>
-                <w:sz w:val="18"/>
-                <w:szCs w:val="18"/>
-                <w:b/>
-                <w:bCs/>
-              </w:rPr>
-              <w:t xml:space="preserve">Zone pair</w:t>
-            </w:r>
-          </w:p>
-        </w:tc>
-        <w:tc>
-          <w:tcPr>
-            <w:tcW w:type="dxa" w:w="600"/>
-            <w:tcMar>
-              <w:top w:type="dxa" w:w="60"/>
-              <w:left w:type="dxa" w:w="90"/>
-              <w:bottom w:type="dxa" w:w="60"/>
-              <w:right w:type="dxa" w:w="90"/>
-            </w:tcMar>
-          </w:tcPr>
-          <w:p>
-            <w:pPr>
-              <w:spacing w:after="0" w:line="240"/>
-            </w:pPr>
-            <w:r>
-              <w:rPr>
-                <w:sz w:val="18"/>
-                <w:szCs w:val="18"/>
-                <w:b/>
-                <w:bCs/>
-              </w:rPr>
-              <w:t xml:space="preserve">n</w:t>
-            </w:r>
-          </w:p>
-        </w:tc>
-        <w:tc>
-          <w:tcPr>
-            <w:tcW w:type="dxa" w:w="600"/>
-            <w:tcMar>
-              <w:top w:type="dxa" w:w="60"/>
-              <w:left w:type="dxa" w:w="90"/>
-              <w:bottom w:type="dxa" w:w="60"/>
-              <w:right w:type="dxa" w:w="90"/>
-            </w:tcMar>
-          </w:tcPr>
-          <w:p>
-            <w:pPr>
-              <w:spacing w:after="0" w:line="240"/>
-            </w:pPr>
-            <w:r>
-              <w:rPr>
-                <w:sz w:val="18"/>
-                <w:szCs w:val="18"/>
-                <w:b/>
-                <w:bCs/>
-              </w:rPr>
-              <w:t xml:space="preserve">n</w:t>
-            </w:r>
-          </w:p>
-        </w:tc>
-        <w:tc>
-          <w:tcPr>
-            <w:tcW w:type="dxa" w:w="1000"/>
-            <w:tcMar>
-              <w:top w:type="dxa" w:w="60"/>
-              <w:left w:type="dxa" w:w="90"/>
-              <w:bottom w:type="dxa" w:w="60"/>
-              <w:right w:type="dxa" w:w="90"/>
-            </w:tcMar>
-          </w:tcPr>
-          <w:p>
-            <w:pPr>
-              <w:spacing w:after="0" w:line="240"/>
-            </w:pPr>
-            <w:r>
-              <w:rPr>
-                <w:sz w:val="18"/>
-                <w:szCs w:val="18"/>
-                <w:b/>
-                <w:bCs/>
-              </w:rPr>
-              <w:t xml:space="preserve">F</w:t>
-            </w:r>
-            <w:r>
-              <w:rPr>
-                <w:sz w:val="18"/>
-                <w:szCs w:val="18"/>
-                <w:b/>
-                <w:bCs/>
-                <w:vertAlign w:val="subscript"/>
-              </w:rPr>
-              <w:t xml:space="preserve">ST</w:t>
-            </w:r>
-          </w:p>
-        </w:tc>
-        <w:tc>
-          <w:tcPr>
-            <w:tcW w:type="dxa" w:w="1900"/>
-            <w:tcMar>
-              <w:top w:type="dxa" w:w="60"/>
-              <w:left w:type="dxa" w:w="90"/>
-              <w:bottom w:type="dxa" w:w="60"/>
-              <w:right w:type="dxa" w:w="90"/>
-            </w:tcMar>
-          </w:tcPr>
-          <w:p>
-            <w:pPr>
-              <w:spacing w:after="0" w:line="240"/>
-            </w:pPr>
-            <w:r>
-              <w:rPr>
-                <w:sz w:val="18"/>
-                <w:szCs w:val="18"/>
-                <w:b/>
-                <w:bCs/>
-              </w:rPr>
-              <w:t xml:space="preserve">95% CI</w:t>
-            </w:r>
-          </w:p>
-        </w:tc>
-        <w:tc>
-          <w:tcPr>
-            <w:tcW w:type="dxa" w:w="1100"/>
-            <w:tcMar>
-              <w:top w:type="dxa" w:w="60"/>
-              <w:left w:type="dxa" w:w="90"/>
-              <w:bottom w:type="dxa" w:w="60"/>
-              <w:right w:type="dxa" w:w="90"/>
-            </w:tcMar>
-          </w:tcPr>
-          <w:p>
-            <w:pPr>
-              <w:spacing w:after="0" w:line="240"/>
-            </w:pPr>
-            <w:r>
-              <w:rPr>
-                <w:sz w:val="18"/>
-                <w:szCs w:val="18"/>
-                <w:b/>
-                <w:bCs/>
-              </w:rPr>
-              <w:t xml:space="preserve">Excludes zero</w:t>
-            </w:r>
-          </w:p>
-        </w:tc>
-      </w:tr>
-      <w:tr>
-        <w:tc>
-          <w:tcPr>
-            <w:tcW w:type="dxa" w:w="3100"/>
-            <w:tcMar>
-              <w:top w:type="dxa" w:w="60"/>
-              <w:left w:type="dxa" w:w="90"/>
-              <w:bottom w:type="dxa" w:w="60"/>
-              <w:right w:type="dxa" w:w="90"/>
-            </w:tcMar>
-          </w:tcPr>
-          <w:p>
-            <w:pPr>
-              <w:spacing w:after="0" w:line="240"/>
-            </w:pPr>
-            <w:r>
-              <w:rPr>
-                <w:sz w:val="18"/>
-                <w:szCs w:val="18"/>
-              </w:rPr>
-              <w:t xml:space="preserve">Coastal savanna × Guinea savanna</w:t>
-            </w:r>
-          </w:p>
-        </w:tc>
-        <w:tc>
-          <w:tcPr>
-            <w:tcW w:type="dxa" w:w="600"/>
-            <w:tcMar>
-              <w:top w:type="dxa" w:w="60"/>
-              <w:left w:type="dxa" w:w="90"/>
-              <w:bottom w:type="dxa" w:w="60"/>
-              <w:right w:type="dxa" w:w="90"/>
-            </w:tcMar>
-          </w:tcPr>
-          <w:p>
-            <w:pPr>
-              <w:spacing w:after="0" w:line="240"/>
-            </w:pPr>
-            <w:r>
-              <w:rPr>
-                <w:sz w:val="18"/>
-                <w:szCs w:val="18"/>
-              </w:rPr>
-              <w:t xml:space="preserve">204</w:t>
-            </w:r>
-          </w:p>
-        </w:tc>
-        <w:tc>
-          <w:tcPr>
-            <w:tcW w:type="dxa" w:w="600"/>
-            <w:tcMar>
-              <w:top w:type="dxa" w:w="60"/>
-              <w:left w:type="dxa" w:w="90"/>
-              <w:bottom w:type="dxa" w:w="60"/>
-              <w:right w:type="dxa" w:w="90"/>
-            </w:tcMar>
-          </w:tcPr>
-          <w:p>
-            <w:pPr>
-              <w:spacing w:after="0" w:line="240"/>
-            </w:pPr>
-            <w:r>
-              <w:rPr>
-                <w:sz w:val="18"/>
-                <w:szCs w:val="18"/>
-              </w:rPr>
-              <w:t xml:space="preserve">1,334</w:t>
-            </w:r>
-          </w:p>
-        </w:tc>
-        <w:tc>
-          <w:tcPr>
-            <w:tcW w:type="dxa" w:w="1000"/>
-            <w:tcMar>
-              <w:top w:type="dxa" w:w="60"/>
-              <w:left w:type="dxa" w:w="90"/>
-              <w:bottom w:type="dxa" w:w="60"/>
-              <w:right w:type="dxa" w:w="90"/>
-            </w:tcMar>
-          </w:tcPr>
-          <w:p>
-            <w:pPr>
-              <w:spacing w:after="0" w:line="240"/>
-            </w:pPr>
-            <w:r>
-              <w:rPr>
-                <w:sz w:val="18"/>
-                <w:szCs w:val="18"/>
-              </w:rPr>
-              <w:t xml:space="preserve">0.00232</w:t>
-            </w:r>
-          </w:p>
-        </w:tc>
-        <w:tc>
-          <w:tcPr>
-            <w:tcW w:type="dxa" w:w="1900"/>
-            <w:tcMar>
-              <w:top w:type="dxa" w:w="60"/>
-              <w:left w:type="dxa" w:w="90"/>
-              <w:bottom w:type="dxa" w:w="60"/>
-              <w:right w:type="dxa" w:w="90"/>
-            </w:tcMar>
-          </w:tcPr>
-          <w:p>
-            <w:pPr>
-              <w:spacing w:after="0" w:line="240"/>
-            </w:pPr>
-            <w:r>
-              <w:rPr>
-                <w:sz w:val="18"/>
-                <w:szCs w:val="18"/>
-              </w:rPr>
-              <w:t xml:space="preserve">0.00128 – 0.00336</w:t>
-            </w:r>
-          </w:p>
-        </w:tc>
-        <w:tc>
-          <w:tcPr>
-            <w:tcW w:type="dxa" w:w="1100"/>
-            <w:tcMar>
-              <w:top w:type="dxa" w:w="60"/>
-              <w:left w:type="dxa" w:w="90"/>
-              <w:bottom w:type="dxa" w:w="60"/>
-              <w:right w:type="dxa" w:w="90"/>
-            </w:tcMar>
-          </w:tcPr>
-          <w:p>
-            <w:pPr>
-              <w:spacing w:after="0" w:line="240"/>
-            </w:pPr>
-            <w:r>
-              <w:rPr>
-                <w:sz w:val="18"/>
-                <w:szCs w:val="18"/>
-              </w:rPr>
-              <w:t xml:space="preserve">Yes</w:t>
-            </w:r>
-          </w:p>
-        </w:tc>
-      </w:tr>
-      <w:tr>
-        <w:tc>
-          <w:tcPr>
-            <w:tcW w:type="dxa" w:w="3100"/>
-            <w:tcMar>
-              <w:top w:type="dxa" w:w="60"/>
-              <w:left w:type="dxa" w:w="90"/>
-              <w:bottom w:type="dxa" w:w="60"/>
-              <w:right w:type="dxa" w:w="90"/>
-            </w:tcMar>
-          </w:tcPr>
-          <w:p>
-            <w:pPr>
-              <w:spacing w:after="0" w:line="240"/>
-            </w:pPr>
-            <w:r>
-              <w:rPr>
-                <w:sz w:val="18"/>
-                <w:szCs w:val="18"/>
-              </w:rPr>
-              <w:t xml:space="preserve">Coastal savanna × Transitional zone</w:t>
-            </w:r>
-          </w:p>
-        </w:tc>
-        <w:tc>
-          <w:tcPr>
-            <w:tcW w:type="dxa" w:w="600"/>
-            <w:tcMar>
-              <w:top w:type="dxa" w:w="60"/>
-              <w:left w:type="dxa" w:w="90"/>
-              <w:bottom w:type="dxa" w:w="60"/>
-              <w:right w:type="dxa" w:w="90"/>
-            </w:tcMar>
-          </w:tcPr>
-          <w:p>
-            <w:pPr>
-              <w:spacing w:after="0" w:line="240"/>
-            </w:pPr>
-            <w:r>
-              <w:rPr>
-                <w:sz w:val="18"/>
-                <w:szCs w:val="18"/>
-              </w:rPr>
-              <w:t xml:space="preserve">204</w:t>
-            </w:r>
-          </w:p>
-        </w:tc>
-        <w:tc>
-          <w:tcPr>
-            <w:tcW w:type="dxa" w:w="600"/>
-            <w:tcMar>
-              <w:top w:type="dxa" w:w="60"/>
-              <w:left w:type="dxa" w:w="90"/>
-              <w:bottom w:type="dxa" w:w="60"/>
-              <w:right w:type="dxa" w:w="90"/>
-            </w:tcMar>
-          </w:tcPr>
-          <w:p>
-            <w:pPr>
-              <w:spacing w:after="0" w:line="240"/>
-            </w:pPr>
-            <w:r>
-              <w:rPr>
-                <w:sz w:val="18"/>
-                <w:szCs w:val="18"/>
-              </w:rPr>
-              <w:t xml:space="preserve">25</w:t>
-            </w:r>
-          </w:p>
-        </w:tc>
-        <w:tc>
-          <w:tcPr>
-            <w:tcW w:type="dxa" w:w="1000"/>
-            <w:tcMar>
-              <w:top w:type="dxa" w:w="60"/>
-              <w:left w:type="dxa" w:w="90"/>
-              <w:bottom w:type="dxa" w:w="60"/>
-              <w:right w:type="dxa" w:w="90"/>
-            </w:tcMar>
-          </w:tcPr>
-          <w:p>
-            <w:pPr>
-              <w:spacing w:after="0" w:line="240"/>
-            </w:pPr>
-            <w:r>
-              <w:rPr>
-                <w:sz w:val="18"/>
-                <w:szCs w:val="18"/>
-              </w:rPr>
-              <w:t xml:space="preserve">0.00158</w:t>
-            </w:r>
-          </w:p>
-        </w:tc>
-        <w:tc>
-          <w:tcPr>
-            <w:tcW w:type="dxa" w:w="1900"/>
-            <w:tcMar>
-              <w:top w:type="dxa" w:w="60"/>
-              <w:left w:type="dxa" w:w="90"/>
-              <w:bottom w:type="dxa" w:w="60"/>
-              <w:right w:type="dxa" w:w="90"/>
-            </w:tcMar>
-          </w:tcPr>
-          <w:p>
-            <w:pPr>
-              <w:spacing w:after="0" w:line="240"/>
-            </w:pPr>
-            <w:r>
-              <w:rPr>
-                <w:sz w:val="18"/>
-                <w:szCs w:val="18"/>
-              </w:rPr>
-              <w:t xml:space="preserve">0.00006 – 0.00309</w:t>
-            </w:r>
-          </w:p>
-        </w:tc>
-        <w:tc>
-          <w:tcPr>
-            <w:tcW w:type="dxa" w:w="1100"/>
-            <w:tcMar>
-              <w:top w:type="dxa" w:w="60"/>
-              <w:left w:type="dxa" w:w="90"/>
-              <w:bottom w:type="dxa" w:w="60"/>
-              <w:right w:type="dxa" w:w="90"/>
-            </w:tcMar>
-          </w:tcPr>
-          <w:p>
-            <w:pPr>
-              <w:spacing w:after="0" w:line="240"/>
-            </w:pPr>
-            <w:r>
-              <w:rPr>
-                <w:sz w:val="18"/>
-                <w:szCs w:val="18"/>
-              </w:rPr>
-              <w:t xml:space="preserve">Yes</w:t>
-            </w:r>
-          </w:p>
-        </w:tc>
-      </w:tr>
-      <w:tr>
-        <w:tc>
-          <w:tcPr>
-            <w:tcW w:type="dxa" w:w="3100"/>
-            <w:tcMar>
-              <w:top w:type="dxa" w:w="60"/>
-              <w:left w:type="dxa" w:w="90"/>
-              <w:bottom w:type="dxa" w:w="60"/>
-              <w:right w:type="dxa" w:w="90"/>
-            </w:tcMar>
-          </w:tcPr>
-          <w:p>
-            <w:pPr>
-              <w:spacing w:after="0" w:line="240"/>
-            </w:pPr>
-            <w:r>
-              <w:rPr>
-                <w:sz w:val="18"/>
-                <w:szCs w:val="18"/>
-              </w:rPr>
-              <w:t xml:space="preserve">Deciduous forest × Transitional zone</w:t>
-            </w:r>
-          </w:p>
-        </w:tc>
-        <w:tc>
-          <w:tcPr>
-            <w:tcW w:type="dxa" w:w="600"/>
-            <w:tcMar>
-              <w:top w:type="dxa" w:w="60"/>
-              <w:left w:type="dxa" w:w="90"/>
-              <w:bottom w:type="dxa" w:w="60"/>
-              <w:right w:type="dxa" w:w="90"/>
-            </w:tcMar>
-          </w:tcPr>
-          <w:p>
-            <w:pPr>
-              <w:spacing w:after="0" w:line="240"/>
-            </w:pPr>
-            <w:r>
-              <w:rPr>
-                <w:sz w:val="18"/>
-                <w:szCs w:val="18"/>
-              </w:rPr>
-              <w:t xml:space="preserve">337</w:t>
-            </w:r>
-          </w:p>
-        </w:tc>
-        <w:tc>
-          <w:tcPr>
-            <w:tcW w:type="dxa" w:w="600"/>
-            <w:tcMar>
-              <w:top w:type="dxa" w:w="60"/>
-              <w:left w:type="dxa" w:w="90"/>
-              <w:bottom w:type="dxa" w:w="60"/>
-              <w:right w:type="dxa" w:w="90"/>
-            </w:tcMar>
-          </w:tcPr>
-          <w:p>
-            <w:pPr>
-              <w:spacing w:after="0" w:line="240"/>
-            </w:pPr>
-            <w:r>
-              <w:rPr>
-                <w:sz w:val="18"/>
-                <w:szCs w:val="18"/>
-              </w:rPr>
-              <w:t xml:space="preserve">25</w:t>
-            </w:r>
-          </w:p>
-        </w:tc>
-        <w:tc>
-          <w:tcPr>
-            <w:tcW w:type="dxa" w:w="1000"/>
-            <w:tcMar>
-              <w:top w:type="dxa" w:w="60"/>
-              <w:left w:type="dxa" w:w="90"/>
-              <w:bottom w:type="dxa" w:w="60"/>
-              <w:right w:type="dxa" w:w="90"/>
-            </w:tcMar>
-          </w:tcPr>
-          <w:p>
-            <w:pPr>
-              <w:spacing w:after="0" w:line="240"/>
-            </w:pPr>
-            <w:r>
-              <w:rPr>
-                <w:sz w:val="18"/>
-                <w:szCs w:val="18"/>
-              </w:rPr>
-              <w:t xml:space="preserve">0.00158</w:t>
-            </w:r>
-          </w:p>
-        </w:tc>
-        <w:tc>
-          <w:tcPr>
-            <w:tcW w:type="dxa" w:w="1900"/>
-            <w:tcMar>
-              <w:top w:type="dxa" w:w="60"/>
-              <w:left w:type="dxa" w:w="90"/>
-              <w:bottom w:type="dxa" w:w="60"/>
-              <w:right w:type="dxa" w:w="90"/>
-            </w:tcMar>
-          </w:tcPr>
-          <w:p>
-            <w:pPr>
-              <w:spacing w:after="0" w:line="240"/>
-            </w:pPr>
-            <w:r>
-              <w:rPr>
-                <w:sz w:val="18"/>
-                <w:szCs w:val="18"/>
-              </w:rPr>
-              <w:t xml:space="preserve">0.00017 – 0.00298</w:t>
-            </w:r>
-          </w:p>
-        </w:tc>
-        <w:tc>
-          <w:tcPr>
-            <w:tcW w:type="dxa" w:w="1100"/>
-            <w:tcMar>
-              <w:top w:type="dxa" w:w="60"/>
-              <w:left w:type="dxa" w:w="90"/>
-              <w:bottom w:type="dxa" w:w="60"/>
-              <w:right w:type="dxa" w:w="90"/>
-            </w:tcMar>
-          </w:tcPr>
-          <w:p>
-            <w:pPr>
-              <w:spacing w:after="0" w:line="240"/>
-            </w:pPr>
-            <w:r>
-              <w:rPr>
-                <w:sz w:val="18"/>
-                <w:szCs w:val="18"/>
-              </w:rPr>
-              <w:t xml:space="preserve">Yes</w:t>
-            </w:r>
-          </w:p>
-        </w:tc>
-      </w:tr>
-      <w:tr>
-        <w:tc>
-          <w:tcPr>
-            <w:tcW w:type="dxa" w:w="3100"/>
-            <w:tcMar>
-              <w:top w:type="dxa" w:w="60"/>
-              <w:left w:type="dxa" w:w="90"/>
-              <w:bottom w:type="dxa" w:w="60"/>
-              <w:right w:type="dxa" w:w="90"/>
-            </w:tcMar>
-          </w:tcPr>
-          <w:p>
-            <w:pPr>
-              <w:spacing w:after="0" w:line="240"/>
-            </w:pPr>
-            <w:r>
-              <w:rPr>
-                <w:sz w:val="18"/>
-                <w:szCs w:val="18"/>
-              </w:rPr>
-              <w:t xml:space="preserve">Deciduous forest × Guinea savanna</w:t>
-            </w:r>
-          </w:p>
-        </w:tc>
-        <w:tc>
-          <w:tcPr>
-            <w:tcW w:type="dxa" w:w="600"/>
-            <w:tcMar>
-              <w:top w:type="dxa" w:w="60"/>
-              <w:left w:type="dxa" w:w="90"/>
-              <w:bottom w:type="dxa" w:w="60"/>
-              <w:right w:type="dxa" w:w="90"/>
-            </w:tcMar>
-          </w:tcPr>
-          <w:p>
-            <w:pPr>
-              <w:spacing w:after="0" w:line="240"/>
-            </w:pPr>
-            <w:r>
-              <w:rPr>
-                <w:sz w:val="18"/>
-                <w:szCs w:val="18"/>
-              </w:rPr>
-              <w:t xml:space="preserve">337</w:t>
-            </w:r>
-          </w:p>
-        </w:tc>
-        <w:tc>
-          <w:tcPr>
-            <w:tcW w:type="dxa" w:w="600"/>
-            <w:tcMar>
-              <w:top w:type="dxa" w:w="60"/>
-              <w:left w:type="dxa" w:w="90"/>
-              <w:bottom w:type="dxa" w:w="60"/>
-              <w:right w:type="dxa" w:w="90"/>
-            </w:tcMar>
-          </w:tcPr>
-          <w:p>
-            <w:pPr>
-              <w:spacing w:after="0" w:line="240"/>
-            </w:pPr>
-            <w:r>
-              <w:rPr>
-                <w:sz w:val="18"/>
-                <w:szCs w:val="18"/>
-              </w:rPr>
-              <w:t xml:space="preserve">1,334</w:t>
-            </w:r>
-          </w:p>
-        </w:tc>
-        <w:tc>
-          <w:tcPr>
-            <w:tcW w:type="dxa" w:w="1000"/>
-            <w:tcMar>
-              <w:top w:type="dxa" w:w="60"/>
-              <w:left w:type="dxa" w:w="90"/>
-              <w:bottom w:type="dxa" w:w="60"/>
-              <w:right w:type="dxa" w:w="90"/>
-            </w:tcMar>
-          </w:tcPr>
-          <w:p>
-            <w:pPr>
-              <w:spacing w:after="0" w:line="240"/>
-            </w:pPr>
-            <w:r>
-              <w:rPr>
-                <w:sz w:val="18"/>
-                <w:szCs w:val="18"/>
-              </w:rPr>
-              <w:t xml:space="preserve">0.00134</w:t>
-            </w:r>
-          </w:p>
-        </w:tc>
-        <w:tc>
-          <w:tcPr>
-            <w:tcW w:type="dxa" w:w="1900"/>
-            <w:tcMar>
-              <w:top w:type="dxa" w:w="60"/>
-              <w:left w:type="dxa" w:w="90"/>
-              <w:bottom w:type="dxa" w:w="60"/>
-              <w:right w:type="dxa" w:w="90"/>
-            </w:tcMar>
-          </w:tcPr>
-          <w:p>
-            <w:pPr>
-              <w:spacing w:after="0" w:line="240"/>
-            </w:pPr>
-            <w:r>
-              <w:rPr>
-                <w:sz w:val="18"/>
-                <w:szCs w:val="18"/>
-              </w:rPr>
-              <w:t xml:space="preserve">0.00088 – 0.00180</w:t>
-            </w:r>
-          </w:p>
-        </w:tc>
-        <w:tc>
-          <w:tcPr>
-            <w:tcW w:type="dxa" w:w="1100"/>
-            <w:tcMar>
-              <w:top w:type="dxa" w:w="60"/>
-              <w:left w:type="dxa" w:w="90"/>
-              <w:bottom w:type="dxa" w:w="60"/>
-              <w:right w:type="dxa" w:w="90"/>
-            </w:tcMar>
-          </w:tcPr>
-          <w:p>
-            <w:pPr>
-              <w:spacing w:after="0" w:line="240"/>
-            </w:pPr>
-            <w:r>
-              <w:rPr>
-                <w:sz w:val="18"/>
-                <w:szCs w:val="18"/>
-              </w:rPr>
-              <w:t xml:space="preserve">Yes</w:t>
-            </w:r>
-          </w:p>
-        </w:tc>
-      </w:tr>
-      <w:tr>
-        <w:tc>
-          <w:tcPr>
-            <w:tcW w:type="dxa" w:w="3100"/>
-            <w:tcMar>
-              <w:top w:type="dxa" w:w="60"/>
-              <w:left w:type="dxa" w:w="90"/>
-              <w:bottom w:type="dxa" w:w="60"/>
-              <w:right w:type="dxa" w:w="90"/>
-            </w:tcMar>
-          </w:tcPr>
-          <w:p>
-            <w:pPr>
-              <w:spacing w:after="0" w:line="240"/>
-            </w:pPr>
-            <w:r>
-              <w:rPr>
-                <w:sz w:val="18"/>
-                <w:szCs w:val="18"/>
-              </w:rPr>
-              <w:t xml:space="preserve">Guinea savanna × Transitional zone</w:t>
-            </w:r>
-          </w:p>
-        </w:tc>
-        <w:tc>
-          <w:tcPr>
-            <w:tcW w:type="dxa" w:w="600"/>
-            <w:tcMar>
-              <w:top w:type="dxa" w:w="60"/>
-              <w:left w:type="dxa" w:w="90"/>
-              <w:bottom w:type="dxa" w:w="60"/>
-              <w:right w:type="dxa" w:w="90"/>
-            </w:tcMar>
-          </w:tcPr>
-          <w:p>
-            <w:pPr>
-              <w:spacing w:after="0" w:line="240"/>
-            </w:pPr>
-            <w:r>
-              <w:rPr>
-                <w:sz w:val="18"/>
-                <w:szCs w:val="18"/>
-              </w:rPr>
-              <w:t xml:space="preserve">1,334</w:t>
-            </w:r>
-          </w:p>
-        </w:tc>
-        <w:tc>
-          <w:tcPr>
-            <w:tcW w:type="dxa" w:w="600"/>
-            <w:tcMar>
-              <w:top w:type="dxa" w:w="60"/>
-              <w:left w:type="dxa" w:w="90"/>
-              <w:bottom w:type="dxa" w:w="60"/>
-              <w:right w:type="dxa" w:w="90"/>
-            </w:tcMar>
-          </w:tcPr>
-          <w:p>
-            <w:pPr>
-              <w:spacing w:after="0" w:line="240"/>
-            </w:pPr>
-            <w:r>
-              <w:rPr>
-                <w:sz w:val="18"/>
-                <w:szCs w:val="18"/>
-              </w:rPr>
-              <w:t xml:space="preserve">25</w:t>
-            </w:r>
-          </w:p>
-        </w:tc>
-        <w:tc>
-          <w:tcPr>
-            <w:tcW w:type="dxa" w:w="1000"/>
-            <w:tcMar>
-              <w:top w:type="dxa" w:w="60"/>
-              <w:left w:type="dxa" w:w="90"/>
-              <w:bottom w:type="dxa" w:w="60"/>
-              <w:right w:type="dxa" w:w="90"/>
-            </w:tcMar>
-          </w:tcPr>
-          <w:p>
-            <w:pPr>
-              <w:spacing w:after="0" w:line="240"/>
-            </w:pPr>
-            <w:r>
-              <w:rPr>
-                <w:sz w:val="18"/>
-                <w:szCs w:val="18"/>
-              </w:rPr>
-              <w:t xml:space="preserve">0.00047</w:t>
-            </w:r>
-          </w:p>
-        </w:tc>
-        <w:tc>
-          <w:tcPr>
-            <w:tcW w:type="dxa" w:w="1900"/>
-            <w:tcMar>
-              <w:top w:type="dxa" w:w="60"/>
-              <w:left w:type="dxa" w:w="90"/>
-              <w:bottom w:type="dxa" w:w="60"/>
-              <w:right w:type="dxa" w:w="90"/>
-            </w:tcMar>
-          </w:tcPr>
-          <w:p>
-            <w:pPr>
-              <w:spacing w:after="0" w:line="240"/>
-            </w:pPr>
-            <w:r>
-              <w:rPr>
-                <w:sz w:val="18"/>
-                <w:szCs w:val="18"/>
-              </w:rPr>
-              <w:t xml:space="preserve">−0.00083 – 0.00178</w:t>
-            </w:r>
-          </w:p>
-        </w:tc>
-        <w:tc>
-          <w:tcPr>
-            <w:tcW w:type="dxa" w:w="1100"/>
-            <w:tcMar>
-              <w:top w:type="dxa" w:w="60"/>
-              <w:left w:type="dxa" w:w="90"/>
-              <w:bottom w:type="dxa" w:w="60"/>
-              <w:right w:type="dxa" w:w="90"/>
-            </w:tcMar>
-          </w:tcPr>
-          <w:p>
-            <w:pPr>
-              <w:spacing w:after="0" w:line="240"/>
-            </w:pPr>
-            <w:r>
-              <w:rPr>
-                <w:sz w:val="18"/>
-                <w:szCs w:val="18"/>
-              </w:rPr>
-              <w:t xml:space="preserve">No</w:t>
-            </w:r>
-          </w:p>
-        </w:tc>
-      </w:tr>
-      <w:tr>
-        <w:tc>
-          <w:tcPr>
-            <w:tcW w:type="dxa" w:w="3100"/>
-            <w:tcMar>
-              <w:top w:type="dxa" w:w="60"/>
-              <w:left w:type="dxa" w:w="90"/>
-              <w:bottom w:type="dxa" w:w="60"/>
-              <w:right w:type="dxa" w:w="90"/>
-            </w:tcMar>
-          </w:tcPr>
-          <w:p>
-            <w:pPr>
-              <w:spacing w:after="0" w:line="240"/>
-            </w:pPr>
-            <w:r>
-              <w:rPr>
-                <w:sz w:val="18"/>
-                <w:szCs w:val="18"/>
-              </w:rPr>
-              <w:t xml:space="preserve">Coastal savanna × Deciduous forest</w:t>
-            </w:r>
-          </w:p>
-        </w:tc>
-        <w:tc>
-          <w:tcPr>
-            <w:tcW w:type="dxa" w:w="600"/>
-            <w:tcMar>
-              <w:top w:type="dxa" w:w="60"/>
-              <w:left w:type="dxa" w:w="90"/>
-              <w:bottom w:type="dxa" w:w="60"/>
-              <w:right w:type="dxa" w:w="90"/>
-            </w:tcMar>
-          </w:tcPr>
-          <w:p>
-            <w:pPr>
-              <w:spacing w:after="0" w:line="240"/>
-            </w:pPr>
-            <w:r>
-              <w:rPr>
-                <w:sz w:val="18"/>
-                <w:szCs w:val="18"/>
-              </w:rPr>
-              <w:t xml:space="preserve">204</w:t>
-            </w:r>
-          </w:p>
-        </w:tc>
-        <w:tc>
-          <w:tcPr>
-            <w:tcW w:type="dxa" w:w="600"/>
-            <w:tcMar>
-              <w:top w:type="dxa" w:w="60"/>
-              <w:left w:type="dxa" w:w="90"/>
-              <w:bottom w:type="dxa" w:w="60"/>
-              <w:right w:type="dxa" w:w="90"/>
-            </w:tcMar>
-          </w:tcPr>
-          <w:p>
-            <w:pPr>
-              <w:spacing w:after="0" w:line="240"/>
-            </w:pPr>
-            <w:r>
-              <w:rPr>
-                <w:sz w:val="18"/>
-                <w:szCs w:val="18"/>
-              </w:rPr>
-              <w:t xml:space="preserve">337</w:t>
-            </w:r>
-          </w:p>
-        </w:tc>
-        <w:tc>
-          <w:tcPr>
-            <w:tcW w:type="dxa" w:w="1000"/>
-            <w:tcMar>
-              <w:top w:type="dxa" w:w="60"/>
-              <w:left w:type="dxa" w:w="90"/>
-              <w:bottom w:type="dxa" w:w="60"/>
-              <w:right w:type="dxa" w:w="90"/>
-            </w:tcMar>
-          </w:tcPr>
-          <w:p>
-            <w:pPr>
-              <w:spacing w:after="0" w:line="240"/>
-            </w:pPr>
-            <w:r>
-              <w:rPr>
-                <w:sz w:val="18"/>
-                <w:szCs w:val="18"/>
-              </w:rPr>
-              <w:t xml:space="preserve">0.00045</w:t>
-            </w:r>
-          </w:p>
-        </w:tc>
-        <w:tc>
-          <w:tcPr>
-            <w:tcW w:type="dxa" w:w="1900"/>
-            <w:tcMar>
-              <w:top w:type="dxa" w:w="60"/>
-              <w:left w:type="dxa" w:w="90"/>
-              <w:bottom w:type="dxa" w:w="60"/>
-              <w:right w:type="dxa" w:w="90"/>
-            </w:tcMar>
-          </w:tcPr>
-          <w:p>
-            <w:pPr>
-              <w:spacing w:after="0" w:line="240"/>
-            </w:pPr>
-            <w:r>
-              <w:rPr>
-                <w:sz w:val="18"/>
-                <w:szCs w:val="18"/>
-              </w:rPr>
-              <w:t xml:space="preserve">0.00019 – 0.00070</w:t>
-            </w:r>
-          </w:p>
-        </w:tc>
-        <w:tc>
-          <w:tcPr>
-            <w:tcW w:type="dxa" w:w="1100"/>
-            <w:tcMar>
-              <w:top w:type="dxa" w:w="60"/>
-              <w:left w:type="dxa" w:w="90"/>
-              <w:bottom w:type="dxa" w:w="60"/>
-              <w:right w:type="dxa" w:w="90"/>
-            </w:tcMar>
-          </w:tcPr>
-          <w:p>
-            <w:pPr>
-              <w:spacing w:after="0" w:line="240"/>
-            </w:pPr>
-            <w:r>
-              <w:rPr>
-                <w:sz w:val="18"/>
-                <w:szCs w:val="18"/>
-              </w:rPr>
-              <w:t xml:space="preserve">Yes</w:t>
-            </w:r>
-          </w:p>
-        </w:tc>
-      </w:tr>
-    </w:tbl>
-    <w:p>
-      <w:pPr>
-        <w:spacing w:after="200" w:line="276"/>
-      </w:pPr>
-    </w:p>
-    <w:p>
-      <w:pPr>
-        <w:spacing w:after="160" w:line="276"/>
-      </w:pPr>
-      <w:r>
-        <w:t xml:space="preserve">The magnitude is stable across the filtering thresholds examined. Across six scenarios built on one shared genotype load - the baseline, F</w:t>
-      </w:r>
-      <w:r>
-        <w:rPr>
-          <w:vertAlign w:val="subscript"/>
-        </w:rPr>
-        <w:t xml:space="preserve">ws</w:t>
-      </w:r>
-      <w:r>
-        <w:t xml:space="preserve"> &gt;= 0.90, F</w:t>
-      </w:r>
-      <w:r>
-        <w:rPr>
-          <w:vertAlign w:val="subscript"/>
-        </w:rPr>
-        <w:t xml:space="preserve">ws</w:t>
-      </w:r>
-      <w:r>
-        <w:t xml:space="preserve"> &gt;= 0.80, no F</w:t>
-      </w:r>
-      <w:r>
-        <w:rPr>
-          <w:vertAlign w:val="subscript"/>
-        </w:rPr>
-        <w:t xml:space="preserve">ws</w:t>
-      </w:r>
-      <w:r>
-        <w:t xml:space="preserve"> filter, MAF &gt;= 0.01 and MAF &gt;= 0.02, spanning 1,900 to 4,403 isolates and 3,275 to 10,876 SNPs - the maximum pairwise F</w:t>
-      </w:r>
-      <w:r>
-        <w:rPr>
-          <w:vertAlign w:val="subscript"/>
-        </w:rPr>
-        <w:t xml:space="preserve">ST</w:t>
-      </w:r>
-      <w:r>
-        <w:t xml:space="preserve"> stays between 0.00204 and 0.00255 (Table 4).</w:t>
-      </w:r>
-    </w:p>
-    <w:p>
-      <w:pPr>
-        <w:spacing w:after="80" w:line="276"/>
-      </w:pPr>
-      <w:r>
-        <w:rPr>
-          <w:sz w:val="18"/>
-          <w:szCs w:val="18"/>
-          <w:b/>
-          <w:bCs/>
-        </w:rPr>
-        <w:t xml:space="preserve">Table 4</w:t>
-      </w:r>
-      <w:r>
-        <w:rPr>
-          <w:sz w:val="18"/>
-          <w:szCs w:val="18"/>
-        </w:rPr>
-        <w:t xml:space="preserve"> Threshold sensitivity of the two headline spatial results. The maximum pairwise F</w:t>
-      </w:r>
-      <w:r>
-        <w:rPr>
-          <w:sz w:val="18"/>
-          <w:szCs w:val="18"/>
-          <w:vertAlign w:val="subscript"/>
-        </w:rPr>
-        <w:t xml:space="preserve">ST</w:t>
-      </w:r>
-      <w:r>
-        <w:rPr>
-          <w:sz w:val="18"/>
-          <w:szCs w:val="18"/>
-        </w:rPr>
-        <w:t xml:space="preserve"> is stable across all six scenarios; the distance effect clears p = 0.05 in only two of them.</w:t>
-      </w:r>
-    </w:p>
-    <w:tbl>
-      <w:tblPr>
-        <w:tblStyle w:val="TableGrid"/>
-        <w:tblW w:type="auto" w:w="0"/>
-        <w:tblBorders>
-          <w:top w:val="single" w:sz="6" w:color="999999"/>
-          <w:bottom w:val="single" w:sz="6" w:color="999999"/>
-          <w:insideH w:val="single" w:sz="4" w:color="CCCCCC"/>
-        </w:tblBorders>
-      </w:tblPr>
-      <w:tblGrid>
-        <w:gridCol w:w="2600"/>
+        <w:gridCol w:w="2700"/>
         <w:gridCol w:w="1000"/>
         <w:gridCol w:w="1000"/>
-        <w:gridCol w:w="1100"/>
         <w:gridCol w:w="1000"/>
-        <w:gridCol w:w="1000"/>
+        <w:gridCol w:w="1700"/>
         <w:gridCol w:w="900"/>
       </w:tblGrid>
       <w:tr>
@@ -3166,7 +2056,7 @@
         </w:trPr>
         <w:tc>
           <w:tcPr>
-            <w:tcW w:type="dxa" w:w="2600"/>
+            <w:tcW w:type="dxa" w:w="2700"/>
             <w:tcMar>
               <w:top w:type="dxa" w:w="60"/>
               <w:left w:type="dxa" w:w="90"/>
@@ -3185,7 +2075,7 @@
                 <w:b/>
                 <w:bCs/>
               </w:rPr>
-              <w:t xml:space="preserve">Scenario</w:t>
+              <w:t xml:space="preserve">Zone pair</w:t>
             </w:r>
           </w:p>
         </w:tc>
@@ -3210,7 +2100,7 @@
                 <w:b/>
                 <w:bCs/>
               </w:rPr>
-              <w:t xml:space="preserve">Isolates</w:t>
+              <w:t xml:space="preserve">n (first zone)</w:t>
             </w:r>
           </w:p>
         </w:tc>
@@ -3235,13 +2125,13 @@
                 <w:b/>
                 <w:bCs/>
               </w:rPr>
-              <w:t xml:space="preserve">SNPs</w:t>
-            </w:r>
-          </w:p>
-        </w:tc>
-        <w:tc>
-          <w:tcPr>
-            <w:tcW w:type="dxa" w:w="1100"/>
+              <w:t xml:space="preserve">n (second zone)</w:t>
+            </w:r>
+          </w:p>
+        </w:tc>
+        <w:tc>
+          <w:tcPr>
+            <w:tcW w:type="dxa" w:w="1000"/>
             <w:tcMar>
               <w:top w:type="dxa" w:w="60"/>
               <w:left w:type="dxa" w:w="90"/>
@@ -3260,7 +2150,7 @@
                 <w:b/>
                 <w:bCs/>
               </w:rPr>
-              <w:t xml:space="preserve">Max F</w:t>
+              <w:t xml:space="preserve">F</w:t>
             </w:r>
             <w:r>
               <w:rPr>
@@ -3276,7 +2166,7 @@
         </w:tc>
         <w:tc>
           <w:tcPr>
-            <w:tcW w:type="dxa" w:w="1000"/>
+            <w:tcW w:type="dxa" w:w="1700"/>
             <w:tcMar>
               <w:top w:type="dxa" w:w="60"/>
               <w:left w:type="dxa" w:w="90"/>
@@ -3295,13 +2185,13 @@
                 <w:b/>
                 <w:bCs/>
               </w:rPr>
-              <w:t xml:space="preserve">Mantel r</w:t>
-            </w:r>
-          </w:p>
-        </w:tc>
-        <w:tc>
-          <w:tcPr>
-            <w:tcW w:type="dxa" w:w="1000"/>
+              <w:t xml:space="preserve">95% CI</w:t>
+            </w:r>
+          </w:p>
+        </w:tc>
+        <w:tc>
+          <w:tcPr>
+            <w:tcW w:type="dxa" w:w="900"/>
             <w:tcMar>
               <w:top w:type="dxa" w:w="60"/>
               <w:left w:type="dxa" w:w="90"/>
@@ -3320,32 +2210,7 @@
                 <w:b/>
                 <w:bCs/>
               </w:rPr>
-              <w:t xml:space="preserve">Mantel p</w:t>
-            </w:r>
-          </w:p>
-        </w:tc>
-        <w:tc>
-          <w:tcPr>
-            <w:tcW w:type="dxa" w:w="900"/>
-            <w:tcMar>
-              <w:top w:type="dxa" w:w="60"/>
-              <w:left w:type="dxa" w:w="90"/>
-              <w:bottom w:type="dxa" w:w="60"/>
-              <w:right w:type="dxa" w:w="90"/>
-            </w:tcMar>
-          </w:tcPr>
-          <w:p>
-            <w:pPr>
-              <w:spacing w:after="0" w:line="240"/>
-            </w:pPr>
-            <w:r>
-              <w:rPr>
-                <w:sz w:val="18"/>
-                <w:szCs w:val="18"/>
-                <w:b/>
-                <w:bCs/>
-              </w:rPr>
-              <w:t xml:space="preserve">p &lt; 0.05</w:t>
+              <w:t xml:space="preserve">Excludes zero</w:t>
             </w:r>
           </w:p>
         </w:tc>
@@ -3353,39 +2218,24 @@
       <w:tr>
         <w:tc>
           <w:tcPr>
-            <w:tcW w:type="dxa" w:w="2600"/>
-            <w:tcMar>
-              <w:top w:type="dxa" w:w="60"/>
-              <w:left w:type="dxa" w:w="90"/>
-              <w:bottom w:type="dxa" w:w="60"/>
-              <w:right w:type="dxa" w:w="90"/>
-            </w:tcMar>
-          </w:tcPr>
-          <w:p>
-            <w:pPr>
-              <w:spacing w:after="0" w:line="240"/>
-            </w:pPr>
-            <w:r>
-              <w:rPr>
-                <w:sz w:val="18"/>
-                <w:szCs w:val="18"/>
-              </w:rPr>
-              <w:t xml:space="preserve">Baseline (F</w:t>
-            </w:r>
-            <w:r>
-              <w:rPr>
-                <w:sz w:val="18"/>
-                <w:szCs w:val="18"/>
-                <w:vertAlign w:val="subscript"/>
-              </w:rPr>
-              <w:t xml:space="preserve">ws</w:t>
-            </w:r>
-            <w:r>
-              <w:rPr>
-                <w:sz w:val="18"/>
-                <w:szCs w:val="18"/>
-              </w:rPr>
-              <w:t xml:space="preserve"> ≥ 0.95, MAF ≥ 0.05)</w:t>
+            <w:tcW w:type="dxa" w:w="2700"/>
+            <w:tcMar>
+              <w:top w:type="dxa" w:w="60"/>
+              <w:left w:type="dxa" w:w="90"/>
+              <w:bottom w:type="dxa" w:w="60"/>
+              <w:right w:type="dxa" w:w="90"/>
+            </w:tcMar>
+          </w:tcPr>
+          <w:p>
+            <w:pPr>
+              <w:spacing w:after="0" w:line="240"/>
+            </w:pPr>
+            <w:r>
+              <w:rPr>
+                <w:sz w:val="18"/>
+                <w:szCs w:val="18"/>
+              </w:rPr>
+              <w:t xml:space="preserve">Coastal savanna × Guinea savanna</w:t>
             </w:r>
           </w:p>
         </w:tc>
@@ -3408,7 +2258,7 @@
                 <w:sz w:val="18"/>
                 <w:szCs w:val="18"/>
               </w:rPr>
-              <w:t xml:space="preserve">1,900</w:t>
+              <w:t xml:space="preserve">204</w:t>
             </w:r>
           </w:p>
         </w:tc>
@@ -3431,13 +2281,13 @@
                 <w:sz w:val="18"/>
                 <w:szCs w:val="18"/>
               </w:rPr>
-              <w:t xml:space="preserve">3,916</w:t>
-            </w:r>
-          </w:p>
-        </w:tc>
-        <w:tc>
-          <w:tcPr>
-            <w:tcW w:type="dxa" w:w="1100"/>
+              <w:t xml:space="preserve">1,334</w:t>
+            </w:r>
+          </w:p>
+        </w:tc>
+        <w:tc>
+          <w:tcPr>
+            <w:tcW w:type="dxa" w:w="1000"/>
             <w:tcMar>
               <w:top w:type="dxa" w:w="60"/>
               <w:left w:type="dxa" w:w="90"/>
@@ -3460,47 +2310,24 @@
         </w:tc>
         <w:tc>
           <w:tcPr>
-            <w:tcW w:type="dxa" w:w="1000"/>
-            <w:tcMar>
-              <w:top w:type="dxa" w:w="60"/>
-              <w:left w:type="dxa" w:w="90"/>
-              <w:bottom w:type="dxa" w:w="60"/>
-              <w:right w:type="dxa" w:w="90"/>
-            </w:tcMar>
-          </w:tcPr>
-          <w:p>
-            <w:pPr>
-              <w:spacing w:after="0" w:line="240"/>
-            </w:pPr>
-            <w:r>
-              <w:rPr>
-                <w:sz w:val="18"/>
-                <w:szCs w:val="18"/>
-              </w:rPr>
-              <w:t xml:space="preserve">0.427</w:t>
-            </w:r>
-          </w:p>
-        </w:tc>
-        <w:tc>
-          <w:tcPr>
-            <w:tcW w:type="dxa" w:w="1000"/>
-            <w:tcMar>
-              <w:top w:type="dxa" w:w="60"/>
-              <w:left w:type="dxa" w:w="90"/>
-              <w:bottom w:type="dxa" w:w="60"/>
-              <w:right w:type="dxa" w:w="90"/>
-            </w:tcMar>
-          </w:tcPr>
-          <w:p>
-            <w:pPr>
-              <w:spacing w:after="0" w:line="240"/>
-            </w:pPr>
-            <w:r>
-              <w:rPr>
-                <w:sz w:val="18"/>
-                <w:szCs w:val="18"/>
-              </w:rPr>
-              <w:t xml:space="preserve">0.0252</w:t>
+            <w:tcW w:type="dxa" w:w="1700"/>
+            <w:tcMar>
+              <w:top w:type="dxa" w:w="60"/>
+              <w:left w:type="dxa" w:w="90"/>
+              <w:bottom w:type="dxa" w:w="60"/>
+              <w:right w:type="dxa" w:w="90"/>
+            </w:tcMar>
+          </w:tcPr>
+          <w:p>
+            <w:pPr>
+              <w:spacing w:after="0" w:line="240"/>
+            </w:pPr>
+            <w:r>
+              <w:rPr>
+                <w:sz w:val="18"/>
+                <w:szCs w:val="18"/>
+              </w:rPr>
+              <w:t xml:space="preserve">0.00128 – 0.00336</w:t>
             </w:r>
           </w:p>
         </w:tc>
@@ -3531,39 +2358,24 @@
       <w:tr>
         <w:tc>
           <w:tcPr>
-            <w:tcW w:type="dxa" w:w="2600"/>
-            <w:tcMar>
-              <w:top w:type="dxa" w:w="60"/>
-              <w:left w:type="dxa" w:w="90"/>
-              <w:bottom w:type="dxa" w:w="60"/>
-              <w:right w:type="dxa" w:w="90"/>
-            </w:tcMar>
-          </w:tcPr>
-          <w:p>
-            <w:pPr>
-              <w:spacing w:after="0" w:line="240"/>
-            </w:pPr>
-            <w:r>
-              <w:rPr>
-                <w:sz w:val="18"/>
-                <w:szCs w:val="18"/>
-              </w:rPr>
-              <w:t xml:space="preserve">F</w:t>
-            </w:r>
-            <w:r>
-              <w:rPr>
-                <w:sz w:val="18"/>
-                <w:szCs w:val="18"/>
-                <w:vertAlign w:val="subscript"/>
-              </w:rPr>
-              <w:t xml:space="preserve">ws</w:t>
-            </w:r>
-            <w:r>
-              <w:rPr>
-                <w:sz w:val="18"/>
-                <w:szCs w:val="18"/>
-              </w:rPr>
-              <w:t xml:space="preserve"> ≥ 0.90</w:t>
+            <w:tcW w:type="dxa" w:w="2700"/>
+            <w:tcMar>
+              <w:top w:type="dxa" w:w="60"/>
+              <w:left w:type="dxa" w:w="90"/>
+              <w:bottom w:type="dxa" w:w="60"/>
+              <w:right w:type="dxa" w:w="90"/>
+            </w:tcMar>
+          </w:tcPr>
+          <w:p>
+            <w:pPr>
+              <w:spacing w:after="0" w:line="240"/>
+            </w:pPr>
+            <w:r>
+              <w:rPr>
+                <w:sz w:val="18"/>
+                <w:szCs w:val="18"/>
+              </w:rPr>
+              <w:t xml:space="preserve">Coastal savanna × Transitional zone</w:t>
             </w:r>
           </w:p>
         </w:tc>
@@ -3586,7 +2398,7 @@
                 <w:sz w:val="18"/>
                 <w:szCs w:val="18"/>
               </w:rPr>
-              <w:t xml:space="preserve">2,196</w:t>
+              <w:t xml:space="preserve">204</w:t>
             </w:r>
           </w:p>
         </w:tc>
@@ -3609,30 +2421,7 @@
                 <w:sz w:val="18"/>
                 <w:szCs w:val="18"/>
               </w:rPr>
-              <w:t xml:space="preserve">3,629</w:t>
-            </w:r>
-          </w:p>
-        </w:tc>
-        <w:tc>
-          <w:tcPr>
-            <w:tcW w:type="dxa" w:w="1100"/>
-            <w:tcMar>
-              <w:top w:type="dxa" w:w="60"/>
-              <w:left w:type="dxa" w:w="90"/>
-              <w:bottom w:type="dxa" w:w="60"/>
-              <w:right w:type="dxa" w:w="90"/>
-            </w:tcMar>
-          </w:tcPr>
-          <w:p>
-            <w:pPr>
-              <w:spacing w:after="0" w:line="240"/>
-            </w:pPr>
-            <w:r>
-              <w:rPr>
-                <w:sz w:val="18"/>
-                <w:szCs w:val="18"/>
-              </w:rPr>
-              <w:t xml:space="preserve">0.00240</w:t>
+              <w:t xml:space="preserve">25</w:t>
             </w:r>
           </w:p>
         </w:tc>
@@ -3655,30 +2444,30 @@
                 <w:sz w:val="18"/>
                 <w:szCs w:val="18"/>
               </w:rPr>
-              <w:t xml:space="preserve">0.318</w:t>
-            </w:r>
-          </w:p>
-        </w:tc>
-        <w:tc>
-          <w:tcPr>
-            <w:tcW w:type="dxa" w:w="1000"/>
-            <w:tcMar>
-              <w:top w:type="dxa" w:w="60"/>
-              <w:left w:type="dxa" w:w="90"/>
-              <w:bottom w:type="dxa" w:w="60"/>
-              <w:right w:type="dxa" w:w="90"/>
-            </w:tcMar>
-          </w:tcPr>
-          <w:p>
-            <w:pPr>
-              <w:spacing w:after="0" w:line="240"/>
-            </w:pPr>
-            <w:r>
-              <w:rPr>
-                <w:sz w:val="18"/>
-                <w:szCs w:val="18"/>
-              </w:rPr>
-              <w:t xml:space="preserve">0.0874</w:t>
+              <w:t xml:space="preserve">0.00158</w:t>
+            </w:r>
+          </w:p>
+        </w:tc>
+        <w:tc>
+          <w:tcPr>
+            <w:tcW w:type="dxa" w:w="1700"/>
+            <w:tcMar>
+              <w:top w:type="dxa" w:w="60"/>
+              <w:left w:type="dxa" w:w="90"/>
+              <w:bottom w:type="dxa" w:w="60"/>
+              <w:right w:type="dxa" w:w="90"/>
+            </w:tcMar>
+          </w:tcPr>
+          <w:p>
+            <w:pPr>
+              <w:spacing w:after="0" w:line="240"/>
+            </w:pPr>
+            <w:r>
+              <w:rPr>
+                <w:sz w:val="18"/>
+                <w:szCs w:val="18"/>
+              </w:rPr>
+              <w:t xml:space="preserve">0.00006 – 0.00309</w:t>
             </w:r>
           </w:p>
         </w:tc>
@@ -3701,7 +2490,7 @@
                 <w:sz w:val="18"/>
                 <w:szCs w:val="18"/>
               </w:rPr>
-              <w:t xml:space="preserve">No</w:t>
+              <w:t xml:space="preserve">Yes</w:t>
             </w:r>
           </w:p>
         </w:tc>
@@ -3709,39 +2498,24 @@
       <w:tr>
         <w:tc>
           <w:tcPr>
-            <w:tcW w:type="dxa" w:w="2600"/>
-            <w:tcMar>
-              <w:top w:type="dxa" w:w="60"/>
-              <w:left w:type="dxa" w:w="90"/>
-              <w:bottom w:type="dxa" w:w="60"/>
-              <w:right w:type="dxa" w:w="90"/>
-            </w:tcMar>
-          </w:tcPr>
-          <w:p>
-            <w:pPr>
-              <w:spacing w:after="0" w:line="240"/>
-            </w:pPr>
-            <w:r>
-              <w:rPr>
-                <w:sz w:val="18"/>
-                <w:szCs w:val="18"/>
-              </w:rPr>
-              <w:t xml:space="preserve">F</w:t>
-            </w:r>
-            <w:r>
-              <w:rPr>
-                <w:sz w:val="18"/>
-                <w:szCs w:val="18"/>
-                <w:vertAlign w:val="subscript"/>
-              </w:rPr>
-              <w:t xml:space="preserve">ws</w:t>
-            </w:r>
-            <w:r>
-              <w:rPr>
-                <w:sz w:val="18"/>
-                <w:szCs w:val="18"/>
-              </w:rPr>
-              <w:t xml:space="preserve"> ≥ 0.80</w:t>
+            <w:tcW w:type="dxa" w:w="2700"/>
+            <w:tcMar>
+              <w:top w:type="dxa" w:w="60"/>
+              <w:left w:type="dxa" w:w="90"/>
+              <w:bottom w:type="dxa" w:w="60"/>
+              <w:right w:type="dxa" w:w="90"/>
+            </w:tcMar>
+          </w:tcPr>
+          <w:p>
+            <w:pPr>
+              <w:spacing w:after="0" w:line="240"/>
+            </w:pPr>
+            <w:r>
+              <w:rPr>
+                <w:sz w:val="18"/>
+                <w:szCs w:val="18"/>
+              </w:rPr>
+              <w:t xml:space="preserve">Deciduous forest × Transitional zone</w:t>
             </w:r>
           </w:p>
         </w:tc>
@@ -3764,7 +2538,7 @@
                 <w:sz w:val="18"/>
                 <w:szCs w:val="18"/>
               </w:rPr>
-              <w:t xml:space="preserve">2,746</w:t>
+              <w:t xml:space="preserve">337</w:t>
             </w:r>
           </w:p>
         </w:tc>
@@ -3787,30 +2561,7 @@
                 <w:sz w:val="18"/>
                 <w:szCs w:val="18"/>
               </w:rPr>
-              <w:t xml:space="preserve">3,496</w:t>
-            </w:r>
-          </w:p>
-        </w:tc>
-        <w:tc>
-          <w:tcPr>
-            <w:tcW w:type="dxa" w:w="1100"/>
-            <w:tcMar>
-              <w:top w:type="dxa" w:w="60"/>
-              <w:left w:type="dxa" w:w="90"/>
-              <w:bottom w:type="dxa" w:w="60"/>
-              <w:right w:type="dxa" w:w="90"/>
-            </w:tcMar>
-          </w:tcPr>
-          <w:p>
-            <w:pPr>
-              <w:spacing w:after="0" w:line="240"/>
-            </w:pPr>
-            <w:r>
-              <w:rPr>
-                <w:sz w:val="18"/>
-                <w:szCs w:val="18"/>
-              </w:rPr>
-              <w:t xml:space="preserve">0.00255</w:t>
+              <w:t xml:space="preserve">25</w:t>
             </w:r>
           </w:p>
         </w:tc>
@@ -3833,30 +2584,30 @@
                 <w:sz w:val="18"/>
                 <w:szCs w:val="18"/>
               </w:rPr>
-              <w:t xml:space="preserve">0.256</w:t>
-            </w:r>
-          </w:p>
-        </w:tc>
-        <w:tc>
-          <w:tcPr>
-            <w:tcW w:type="dxa" w:w="1000"/>
-            <w:tcMar>
-              <w:top w:type="dxa" w:w="60"/>
-              <w:left w:type="dxa" w:w="90"/>
-              <w:bottom w:type="dxa" w:w="60"/>
-              <w:right w:type="dxa" w:w="90"/>
-            </w:tcMar>
-          </w:tcPr>
-          <w:p>
-            <w:pPr>
-              <w:spacing w:after="0" w:line="240"/>
-            </w:pPr>
-            <w:r>
-              <w:rPr>
-                <w:sz w:val="18"/>
-                <w:szCs w:val="18"/>
-              </w:rPr>
-              <w:t xml:space="preserve">0.1687</w:t>
+              <w:t xml:space="preserve">0.00158</w:t>
+            </w:r>
+          </w:p>
+        </w:tc>
+        <w:tc>
+          <w:tcPr>
+            <w:tcW w:type="dxa" w:w="1700"/>
+            <w:tcMar>
+              <w:top w:type="dxa" w:w="60"/>
+              <w:left w:type="dxa" w:w="90"/>
+              <w:bottom w:type="dxa" w:w="60"/>
+              <w:right w:type="dxa" w:w="90"/>
+            </w:tcMar>
+          </w:tcPr>
+          <w:p>
+            <w:pPr>
+              <w:spacing w:after="0" w:line="240"/>
+            </w:pPr>
+            <w:r>
+              <w:rPr>
+                <w:sz w:val="18"/>
+                <w:szCs w:val="18"/>
+              </w:rPr>
+              <w:t xml:space="preserve">0.00017 – 0.00298</w:t>
             </w:r>
           </w:p>
         </w:tc>
@@ -3879,7 +2630,7 @@
                 <w:sz w:val="18"/>
                 <w:szCs w:val="18"/>
               </w:rPr>
-              <w:t xml:space="preserve">No</w:t>
+              <w:t xml:space="preserve">Yes</w:t>
             </w:r>
           </w:p>
         </w:tc>
@@ -3887,39 +2638,24 @@
       <w:tr>
         <w:tc>
           <w:tcPr>
-            <w:tcW w:type="dxa" w:w="2600"/>
-            <w:tcMar>
-              <w:top w:type="dxa" w:w="60"/>
-              <w:left w:type="dxa" w:w="90"/>
-              <w:bottom w:type="dxa" w:w="60"/>
-              <w:right w:type="dxa" w:w="90"/>
-            </w:tcMar>
-          </w:tcPr>
-          <w:p>
-            <w:pPr>
-              <w:spacing w:after="0" w:line="240"/>
-            </w:pPr>
-            <w:r>
-              <w:rPr>
-                <w:sz w:val="18"/>
-                <w:szCs w:val="18"/>
-              </w:rPr>
-              <w:t xml:space="preserve">No F</w:t>
-            </w:r>
-            <w:r>
-              <w:rPr>
-                <w:sz w:val="18"/>
-                <w:szCs w:val="18"/>
-                <w:vertAlign w:val="subscript"/>
-              </w:rPr>
-              <w:t xml:space="preserve">ws</w:t>
-            </w:r>
-            <w:r>
-              <w:rPr>
-                <w:sz w:val="18"/>
-                <w:szCs w:val="18"/>
-              </w:rPr>
-              <w:t xml:space="preserve"> filter</w:t>
+            <w:tcW w:type="dxa" w:w="2700"/>
+            <w:tcMar>
+              <w:top w:type="dxa" w:w="60"/>
+              <w:left w:type="dxa" w:w="90"/>
+              <w:bottom w:type="dxa" w:w="60"/>
+              <w:right w:type="dxa" w:w="90"/>
+            </w:tcMar>
+          </w:tcPr>
+          <w:p>
+            <w:pPr>
+              <w:spacing w:after="0" w:line="240"/>
+            </w:pPr>
+            <w:r>
+              <w:rPr>
+                <w:sz w:val="18"/>
+                <w:szCs w:val="18"/>
+              </w:rPr>
+              <w:t xml:space="preserve">Deciduous forest × Guinea savanna</w:t>
             </w:r>
           </w:p>
         </w:tc>
@@ -3942,7 +2678,7 @@
                 <w:sz w:val="18"/>
                 <w:szCs w:val="18"/>
               </w:rPr>
-              <w:t xml:space="preserve">4,403</w:t>
+              <w:t xml:space="preserve">337</w:t>
             </w:r>
           </w:p>
         </w:tc>
@@ -3965,30 +2701,7 @@
                 <w:sz w:val="18"/>
                 <w:szCs w:val="18"/>
               </w:rPr>
-              <w:t xml:space="preserve">3,275</w:t>
-            </w:r>
-          </w:p>
-        </w:tc>
-        <w:tc>
-          <w:tcPr>
-            <w:tcW w:type="dxa" w:w="1100"/>
-            <w:tcMar>
-              <w:top w:type="dxa" w:w="60"/>
-              <w:left w:type="dxa" w:w="90"/>
-              <w:bottom w:type="dxa" w:w="60"/>
-              <w:right w:type="dxa" w:w="90"/>
-            </w:tcMar>
-          </w:tcPr>
-          <w:p>
-            <w:pPr>
-              <w:spacing w:after="0" w:line="240"/>
-            </w:pPr>
-            <w:r>
-              <w:rPr>
-                <w:sz w:val="18"/>
-                <w:szCs w:val="18"/>
-              </w:rPr>
-              <w:t xml:space="preserve">0.00254</w:t>
+              <w:t xml:space="preserve">1,334</w:t>
             </w:r>
           </w:p>
         </w:tc>
@@ -4011,30 +2724,30 @@
                 <w:sz w:val="18"/>
                 <w:szCs w:val="18"/>
               </w:rPr>
-              <w:t xml:space="preserve">0.245</w:t>
-            </w:r>
-          </w:p>
-        </w:tc>
-        <w:tc>
-          <w:tcPr>
-            <w:tcW w:type="dxa" w:w="1000"/>
-            <w:tcMar>
-              <w:top w:type="dxa" w:w="60"/>
-              <w:left w:type="dxa" w:w="90"/>
-              <w:bottom w:type="dxa" w:w="60"/>
-              <w:right w:type="dxa" w:w="90"/>
-            </w:tcMar>
-          </w:tcPr>
-          <w:p>
-            <w:pPr>
-              <w:spacing w:after="0" w:line="240"/>
-            </w:pPr>
-            <w:r>
-              <w:rPr>
-                <w:sz w:val="18"/>
-                <w:szCs w:val="18"/>
-              </w:rPr>
-              <w:t xml:space="preserve">0.1792</w:t>
+              <w:t xml:space="preserve">0.00134</w:t>
+            </w:r>
+          </w:p>
+        </w:tc>
+        <w:tc>
+          <w:tcPr>
+            <w:tcW w:type="dxa" w:w="1700"/>
+            <w:tcMar>
+              <w:top w:type="dxa" w:w="60"/>
+              <w:left w:type="dxa" w:w="90"/>
+              <w:bottom w:type="dxa" w:w="60"/>
+              <w:right w:type="dxa" w:w="90"/>
+            </w:tcMar>
+          </w:tcPr>
+          <w:p>
+            <w:pPr>
+              <w:spacing w:after="0" w:line="240"/>
+            </w:pPr>
+            <w:r>
+              <w:rPr>
+                <w:sz w:val="18"/>
+                <w:szCs w:val="18"/>
+              </w:rPr>
+              <w:t xml:space="preserve">0.00088 – 0.00180</w:t>
             </w:r>
           </w:p>
         </w:tc>
@@ -4057,7 +2770,7 @@
                 <w:sz w:val="18"/>
                 <w:szCs w:val="18"/>
               </w:rPr>
-              <w:t xml:space="preserve">No</w:t>
+              <w:t xml:space="preserve">Yes</w:t>
             </w:r>
           </w:p>
         </w:tc>
@@ -4065,24 +2778,24 @@
       <w:tr>
         <w:tc>
           <w:tcPr>
-            <w:tcW w:type="dxa" w:w="2600"/>
-            <w:tcMar>
-              <w:top w:type="dxa" w:w="60"/>
-              <w:left w:type="dxa" w:w="90"/>
-              <w:bottom w:type="dxa" w:w="60"/>
-              <w:right w:type="dxa" w:w="90"/>
-            </w:tcMar>
-          </w:tcPr>
-          <w:p>
-            <w:pPr>
-              <w:spacing w:after="0" w:line="240"/>
-            </w:pPr>
-            <w:r>
-              <w:rPr>
-                <w:sz w:val="18"/>
-                <w:szCs w:val="18"/>
-              </w:rPr>
-              <w:t xml:space="preserve">MAF ≥ 0.01</w:t>
+            <w:tcW w:type="dxa" w:w="2700"/>
+            <w:tcMar>
+              <w:top w:type="dxa" w:w="60"/>
+              <w:left w:type="dxa" w:w="90"/>
+              <w:bottom w:type="dxa" w:w="60"/>
+              <w:right w:type="dxa" w:w="90"/>
+            </w:tcMar>
+          </w:tcPr>
+          <w:p>
+            <w:pPr>
+              <w:spacing w:after="0" w:line="240"/>
+            </w:pPr>
+            <w:r>
+              <w:rPr>
+                <w:sz w:val="18"/>
+                <w:szCs w:val="18"/>
+              </w:rPr>
+              <w:t xml:space="preserve">Guinea savanna × Transitional zone</w:t>
             </w:r>
           </w:p>
         </w:tc>
@@ -4105,7 +2818,7 @@
                 <w:sz w:val="18"/>
                 <w:szCs w:val="18"/>
               </w:rPr>
-              <w:t xml:space="preserve">1,900</w:t>
+              <w:t xml:space="preserve">1,334</w:t>
             </w:r>
           </w:p>
         </w:tc>
@@ -4128,30 +2841,7 @@
                 <w:sz w:val="18"/>
                 <w:szCs w:val="18"/>
               </w:rPr>
-              <w:t xml:space="preserve">10,876</w:t>
-            </w:r>
-          </w:p>
-        </w:tc>
-        <w:tc>
-          <w:tcPr>
-            <w:tcW w:type="dxa" w:w="1100"/>
-            <w:tcMar>
-              <w:top w:type="dxa" w:w="60"/>
-              <w:left w:type="dxa" w:w="90"/>
-              <w:bottom w:type="dxa" w:w="60"/>
-              <w:right w:type="dxa" w:w="90"/>
-            </w:tcMar>
-          </w:tcPr>
-          <w:p>
-            <w:pPr>
-              <w:spacing w:after="0" w:line="240"/>
-            </w:pPr>
-            <w:r>
-              <w:rPr>
-                <w:sz w:val="18"/>
-                <w:szCs w:val="18"/>
-              </w:rPr>
-              <w:t xml:space="preserve">0.00204</w:t>
+              <w:t xml:space="preserve">25</w:t>
             </w:r>
           </w:p>
         </w:tc>
@@ -4174,30 +2864,30 @@
                 <w:sz w:val="18"/>
                 <w:szCs w:val="18"/>
               </w:rPr>
-              <w:t xml:space="preserve">0.432</w:t>
-            </w:r>
-          </w:p>
-        </w:tc>
-        <w:tc>
-          <w:tcPr>
-            <w:tcW w:type="dxa" w:w="1000"/>
-            <w:tcMar>
-              <w:top w:type="dxa" w:w="60"/>
-              <w:left w:type="dxa" w:w="90"/>
-              <w:bottom w:type="dxa" w:w="60"/>
-              <w:right w:type="dxa" w:w="90"/>
-            </w:tcMar>
-          </w:tcPr>
-          <w:p>
-            <w:pPr>
-              <w:spacing w:after="0" w:line="240"/>
-            </w:pPr>
-            <w:r>
-              <w:rPr>
-                <w:sz w:val="18"/>
-                <w:szCs w:val="18"/>
-              </w:rPr>
-              <w:t xml:space="preserve">0.0617</w:t>
+              <w:t xml:space="preserve">0.00047</w:t>
+            </w:r>
+          </w:p>
+        </w:tc>
+        <w:tc>
+          <w:tcPr>
+            <w:tcW w:type="dxa" w:w="1700"/>
+            <w:tcMar>
+              <w:top w:type="dxa" w:w="60"/>
+              <w:left w:type="dxa" w:w="90"/>
+              <w:bottom w:type="dxa" w:w="60"/>
+              <w:right w:type="dxa" w:w="90"/>
+            </w:tcMar>
+          </w:tcPr>
+          <w:p>
+            <w:pPr>
+              <w:spacing w:after="0" w:line="240"/>
+            </w:pPr>
+            <w:r>
+              <w:rPr>
+                <w:sz w:val="18"/>
+                <w:szCs w:val="18"/>
+              </w:rPr>
+              <w:t xml:space="preserve">−0.00083 – 0.00178</w:t>
             </w:r>
           </w:p>
         </w:tc>
@@ -4228,24 +2918,24 @@
       <w:tr>
         <w:tc>
           <w:tcPr>
-            <w:tcW w:type="dxa" w:w="2600"/>
-            <w:tcMar>
-              <w:top w:type="dxa" w:w="60"/>
-              <w:left w:type="dxa" w:w="90"/>
-              <w:bottom w:type="dxa" w:w="60"/>
-              <w:right w:type="dxa" w:w="90"/>
-            </w:tcMar>
-          </w:tcPr>
-          <w:p>
-            <w:pPr>
-              <w:spacing w:after="0" w:line="240"/>
-            </w:pPr>
-            <w:r>
-              <w:rPr>
-                <w:sz w:val="18"/>
-                <w:szCs w:val="18"/>
-              </w:rPr>
-              <w:t xml:space="preserve">MAF ≥ 0.02</w:t>
+            <w:tcW w:type="dxa" w:w="2700"/>
+            <w:tcMar>
+              <w:top w:type="dxa" w:w="60"/>
+              <w:left w:type="dxa" w:w="90"/>
+              <w:bottom w:type="dxa" w:w="60"/>
+              <w:right w:type="dxa" w:w="90"/>
+            </w:tcMar>
+          </w:tcPr>
+          <w:p>
+            <w:pPr>
+              <w:spacing w:after="0" w:line="240"/>
+            </w:pPr>
+            <w:r>
+              <w:rPr>
+                <w:sz w:val="18"/>
+                <w:szCs w:val="18"/>
+              </w:rPr>
+              <w:t xml:space="preserve">Coastal savanna × Deciduous forest</w:t>
             </w:r>
           </w:p>
         </w:tc>
@@ -4268,7 +2958,7 @@
                 <w:sz w:val="18"/>
                 <w:szCs w:val="18"/>
               </w:rPr>
-              <w:t xml:space="preserve">1,900</w:t>
+              <w:t xml:space="preserve">204</w:t>
             </w:r>
           </w:p>
         </w:tc>
@@ -4291,30 +2981,7 @@
                 <w:sz w:val="18"/>
                 <w:szCs w:val="18"/>
               </w:rPr>
-              <w:t xml:space="preserve">6,852</w:t>
-            </w:r>
-          </w:p>
-        </w:tc>
-        <w:tc>
-          <w:tcPr>
-            <w:tcW w:type="dxa" w:w="1100"/>
-            <w:tcMar>
-              <w:top w:type="dxa" w:w="60"/>
-              <w:left w:type="dxa" w:w="90"/>
-              <w:bottom w:type="dxa" w:w="60"/>
-              <w:right w:type="dxa" w:w="90"/>
-            </w:tcMar>
-          </w:tcPr>
-          <w:p>
-            <w:pPr>
-              <w:spacing w:after="0" w:line="240"/>
-            </w:pPr>
-            <w:r>
-              <w:rPr>
-                <w:sz w:val="18"/>
-                <w:szCs w:val="18"/>
-              </w:rPr>
-              <w:t xml:space="preserve">0.00217</w:t>
+              <w:t xml:space="preserve">337</w:t>
             </w:r>
           </w:p>
         </w:tc>
@@ -4337,30 +3004,30 @@
                 <w:sz w:val="18"/>
                 <w:szCs w:val="18"/>
               </w:rPr>
-              <w:t xml:space="preserve">0.434</w:t>
-            </w:r>
-          </w:p>
-        </w:tc>
-        <w:tc>
-          <w:tcPr>
-            <w:tcW w:type="dxa" w:w="1000"/>
-            <w:tcMar>
-              <w:top w:type="dxa" w:w="60"/>
-              <w:left w:type="dxa" w:w="90"/>
-              <w:bottom w:type="dxa" w:w="60"/>
-              <w:right w:type="dxa" w:w="90"/>
-            </w:tcMar>
-          </w:tcPr>
-          <w:p>
-            <w:pPr>
-              <w:spacing w:after="0" w:line="240"/>
-            </w:pPr>
-            <w:r>
-              <w:rPr>
-                <w:sz w:val="18"/>
-                <w:szCs w:val="18"/>
-              </w:rPr>
-              <w:t xml:space="preserve">0.0467</w:t>
+              <w:t xml:space="preserve">0.00045</w:t>
+            </w:r>
+          </w:p>
+        </w:tc>
+        <w:tc>
+          <w:tcPr>
+            <w:tcW w:type="dxa" w:w="1700"/>
+            <w:tcMar>
+              <w:top w:type="dxa" w:w="60"/>
+              <w:left w:type="dxa" w:w="90"/>
+              <w:bottom w:type="dxa" w:w="60"/>
+              <w:right w:type="dxa" w:w="90"/>
+            </w:tcMar>
+          </w:tcPr>
+          <w:p>
+            <w:pPr>
+              <w:spacing w:after="0" w:line="240"/>
+            </w:pPr>
+            <w:r>
+              <w:rPr>
+                <w:sz w:val="18"/>
+                <w:szCs w:val="18"/>
+              </w:rPr>
+              <w:t xml:space="preserve">0.00019 – 0.00070</w:t>
             </w:r>
           </w:p>
         </w:tc>
@@ -4393,6 +3060,50 @@
       <w:pPr>
         <w:spacing w:after="200" w:line="276"/>
       </w:pPr>
+    </w:p>
+    <w:p>
+      <w:pPr>
+        <w:spacing w:after="160" w:line="276"/>
+      </w:pPr>
+      <w:r>
+        <w:t xml:space="preserve">The magnitude is stable across the filtering thresholds examined. Across six scenarios built on one shared genotype load - the baseline, F</w:t>
+      </w:r>
+      <w:r>
+        <w:rPr>
+          <w:vertAlign w:val="subscript"/>
+        </w:rPr>
+        <w:t xml:space="preserve">ws</w:t>
+      </w:r>
+      <w:r>
+        <w:t xml:space="preserve"> &gt;= 0.90, F</w:t>
+      </w:r>
+      <w:r>
+        <w:rPr>
+          <w:vertAlign w:val="subscript"/>
+        </w:rPr>
+        <w:t xml:space="preserve">ws</w:t>
+      </w:r>
+      <w:r>
+        <w:t xml:space="preserve"> &gt;= 0.80, no F</w:t>
+      </w:r>
+      <w:r>
+        <w:rPr>
+          <w:vertAlign w:val="subscript"/>
+        </w:rPr>
+        <w:t xml:space="preserve">ws</w:t>
+      </w:r>
+      <w:r>
+        <w:t xml:space="preserve"> filter, MAF &gt;= 0.01 and MAF &gt;= 0.02, spanning 1,900 to 4,403 isolates and 3,275 to 10,876 SNPs - the maximum pairwise F</w:t>
+      </w:r>
+      <w:r>
+        <w:rPr>
+          <w:vertAlign w:val="subscript"/>
+        </w:rPr>
+        <w:t xml:space="preserve">ST</w:t>
+      </w:r>
+      <w:r>
+        <w:t xml:space="preserve"> stays between 0.00204 and 0.00255 (Table 4).</w:t>
+      </w:r>
     </w:p>
     <w:p>
       <w:pPr>
@@ -9050,6 +7761,1295 @@
       <w:r>
         <w:t xml:space="preserve">.</w:t>
       </w:r>
+    </w:p>
+    <w:p>
+      <w:pPr>
+        <w:spacing w:after="80" w:line="276"/>
+      </w:pPr>
+      <w:r>
+        <w:rPr>
+          <w:sz w:val="18"/>
+          <w:szCs w:val="18"/>
+          <w:b/>
+          <w:bCs/>
+        </w:rPr>
+        <w:t xml:space="preserve">Table 4</w:t>
+      </w:r>
+      <w:r>
+        <w:rPr>
+          <w:sz w:val="18"/>
+          <w:szCs w:val="18"/>
+        </w:rPr>
+        <w:t xml:space="preserve"> Threshold sensitivity of the two headline spatial results. The maximum pairwise F</w:t>
+      </w:r>
+      <w:r>
+        <w:rPr>
+          <w:sz w:val="18"/>
+          <w:szCs w:val="18"/>
+          <w:vertAlign w:val="subscript"/>
+        </w:rPr>
+        <w:t xml:space="preserve">ST</w:t>
+      </w:r>
+      <w:r>
+        <w:rPr>
+          <w:sz w:val="18"/>
+          <w:szCs w:val="18"/>
+        </w:rPr>
+        <w:t xml:space="preserve"> is stable across all six scenarios; the distance effect clears p = 0.05 in only two of them.</w:t>
+      </w:r>
+    </w:p>
+    <w:tbl>
+      <w:tblPr>
+        <w:tblStyle w:val="TableGrid"/>
+        <w:tblW w:type="auto" w:w="0"/>
+        <w:tblBorders>
+          <w:top w:val="single" w:sz="6" w:color="999999"/>
+          <w:bottom w:val="single" w:sz="6" w:color="999999"/>
+          <w:insideH w:val="single" w:sz="4" w:color="CCCCCC"/>
+        </w:tblBorders>
+      </w:tblPr>
+      <w:tblGrid>
+        <w:gridCol w:w="2600"/>
+        <w:gridCol w:w="1000"/>
+        <w:gridCol w:w="1000"/>
+        <w:gridCol w:w="1100"/>
+        <w:gridCol w:w="1000"/>
+        <w:gridCol w:w="1000"/>
+        <w:gridCol w:w="900"/>
+      </w:tblGrid>
+      <w:tr>
+        <w:trPr>
+          <w:tblHeader/>
+        </w:trPr>
+        <w:tc>
+          <w:tcPr>
+            <w:tcW w:type="dxa" w:w="2600"/>
+            <w:tcMar>
+              <w:top w:type="dxa" w:w="60"/>
+              <w:left w:type="dxa" w:w="90"/>
+              <w:bottom w:type="dxa" w:w="60"/>
+              <w:right w:type="dxa" w:w="90"/>
+            </w:tcMar>
+          </w:tcPr>
+          <w:p>
+            <w:pPr>
+              <w:spacing w:after="0" w:line="240"/>
+            </w:pPr>
+            <w:r>
+              <w:rPr>
+                <w:sz w:val="18"/>
+                <w:szCs w:val="18"/>
+                <w:b/>
+                <w:bCs/>
+              </w:rPr>
+              <w:t xml:space="preserve">Scenario</w:t>
+            </w:r>
+          </w:p>
+        </w:tc>
+        <w:tc>
+          <w:tcPr>
+            <w:tcW w:type="dxa" w:w="1000"/>
+            <w:tcMar>
+              <w:top w:type="dxa" w:w="60"/>
+              <w:left w:type="dxa" w:w="90"/>
+              <w:bottom w:type="dxa" w:w="60"/>
+              <w:right w:type="dxa" w:w="90"/>
+            </w:tcMar>
+          </w:tcPr>
+          <w:p>
+            <w:pPr>
+              <w:spacing w:after="0" w:line="240"/>
+            </w:pPr>
+            <w:r>
+              <w:rPr>
+                <w:sz w:val="18"/>
+                <w:szCs w:val="18"/>
+                <w:b/>
+                <w:bCs/>
+              </w:rPr>
+              <w:t xml:space="preserve">Isolates</w:t>
+            </w:r>
+          </w:p>
+        </w:tc>
+        <w:tc>
+          <w:tcPr>
+            <w:tcW w:type="dxa" w:w="1000"/>
+            <w:tcMar>
+              <w:top w:type="dxa" w:w="60"/>
+              <w:left w:type="dxa" w:w="90"/>
+              <w:bottom w:type="dxa" w:w="60"/>
+              <w:right w:type="dxa" w:w="90"/>
+            </w:tcMar>
+          </w:tcPr>
+          <w:p>
+            <w:pPr>
+              <w:spacing w:after="0" w:line="240"/>
+            </w:pPr>
+            <w:r>
+              <w:rPr>
+                <w:sz w:val="18"/>
+                <w:szCs w:val="18"/>
+                <w:b/>
+                <w:bCs/>
+              </w:rPr>
+              <w:t xml:space="preserve">SNPs</w:t>
+            </w:r>
+          </w:p>
+        </w:tc>
+        <w:tc>
+          <w:tcPr>
+            <w:tcW w:type="dxa" w:w="1100"/>
+            <w:tcMar>
+              <w:top w:type="dxa" w:w="60"/>
+              <w:left w:type="dxa" w:w="90"/>
+              <w:bottom w:type="dxa" w:w="60"/>
+              <w:right w:type="dxa" w:w="90"/>
+            </w:tcMar>
+          </w:tcPr>
+          <w:p>
+            <w:pPr>
+              <w:spacing w:after="0" w:line="240"/>
+            </w:pPr>
+            <w:r>
+              <w:rPr>
+                <w:sz w:val="18"/>
+                <w:szCs w:val="18"/>
+                <w:b/>
+                <w:bCs/>
+              </w:rPr>
+              <w:t xml:space="preserve">Max F</w:t>
+            </w:r>
+            <w:r>
+              <w:rPr>
+                <w:sz w:val="18"/>
+                <w:szCs w:val="18"/>
+                <w:b/>
+                <w:bCs/>
+                <w:vertAlign w:val="subscript"/>
+              </w:rPr>
+              <w:t xml:space="preserve">ST</w:t>
+            </w:r>
+          </w:p>
+        </w:tc>
+        <w:tc>
+          <w:tcPr>
+            <w:tcW w:type="dxa" w:w="1000"/>
+            <w:tcMar>
+              <w:top w:type="dxa" w:w="60"/>
+              <w:left w:type="dxa" w:w="90"/>
+              <w:bottom w:type="dxa" w:w="60"/>
+              <w:right w:type="dxa" w:w="90"/>
+            </w:tcMar>
+          </w:tcPr>
+          <w:p>
+            <w:pPr>
+              <w:spacing w:after="0" w:line="240"/>
+            </w:pPr>
+            <w:r>
+              <w:rPr>
+                <w:sz w:val="18"/>
+                <w:szCs w:val="18"/>
+                <w:b/>
+                <w:bCs/>
+              </w:rPr>
+              <w:t xml:space="preserve">Mantel r</w:t>
+            </w:r>
+          </w:p>
+        </w:tc>
+        <w:tc>
+          <w:tcPr>
+            <w:tcW w:type="dxa" w:w="1000"/>
+            <w:tcMar>
+              <w:top w:type="dxa" w:w="60"/>
+              <w:left w:type="dxa" w:w="90"/>
+              <w:bottom w:type="dxa" w:w="60"/>
+              <w:right w:type="dxa" w:w="90"/>
+            </w:tcMar>
+          </w:tcPr>
+          <w:p>
+            <w:pPr>
+              <w:spacing w:after="0" w:line="240"/>
+            </w:pPr>
+            <w:r>
+              <w:rPr>
+                <w:sz w:val="18"/>
+                <w:szCs w:val="18"/>
+                <w:b/>
+                <w:bCs/>
+              </w:rPr>
+              <w:t xml:space="preserve">Mantel p</w:t>
+            </w:r>
+          </w:p>
+        </w:tc>
+        <w:tc>
+          <w:tcPr>
+            <w:tcW w:type="dxa" w:w="900"/>
+            <w:tcMar>
+              <w:top w:type="dxa" w:w="60"/>
+              <w:left w:type="dxa" w:w="90"/>
+              <w:bottom w:type="dxa" w:w="60"/>
+              <w:right w:type="dxa" w:w="90"/>
+            </w:tcMar>
+          </w:tcPr>
+          <w:p>
+            <w:pPr>
+              <w:spacing w:after="0" w:line="240"/>
+            </w:pPr>
+            <w:r>
+              <w:rPr>
+                <w:sz w:val="18"/>
+                <w:szCs w:val="18"/>
+                <w:b/>
+                <w:bCs/>
+              </w:rPr>
+              <w:t xml:space="preserve">p &lt; 0.05</w:t>
+            </w:r>
+          </w:p>
+        </w:tc>
+      </w:tr>
+      <w:tr>
+        <w:tc>
+          <w:tcPr>
+            <w:tcW w:type="dxa" w:w="2600"/>
+            <w:tcMar>
+              <w:top w:type="dxa" w:w="60"/>
+              <w:left w:type="dxa" w:w="90"/>
+              <w:bottom w:type="dxa" w:w="60"/>
+              <w:right w:type="dxa" w:w="90"/>
+            </w:tcMar>
+          </w:tcPr>
+          <w:p>
+            <w:pPr>
+              <w:spacing w:after="0" w:line="240"/>
+            </w:pPr>
+            <w:r>
+              <w:rPr>
+                <w:sz w:val="18"/>
+                <w:szCs w:val="18"/>
+              </w:rPr>
+              <w:t xml:space="preserve">Baseline (F</w:t>
+            </w:r>
+            <w:r>
+              <w:rPr>
+                <w:sz w:val="18"/>
+                <w:szCs w:val="18"/>
+                <w:vertAlign w:val="subscript"/>
+              </w:rPr>
+              <w:t xml:space="preserve">ws</w:t>
+            </w:r>
+            <w:r>
+              <w:rPr>
+                <w:sz w:val="18"/>
+                <w:szCs w:val="18"/>
+              </w:rPr>
+              <w:t xml:space="preserve"> ≥ 0.95, MAF ≥ 0.05)</w:t>
+            </w:r>
+          </w:p>
+        </w:tc>
+        <w:tc>
+          <w:tcPr>
+            <w:tcW w:type="dxa" w:w="1000"/>
+            <w:tcMar>
+              <w:top w:type="dxa" w:w="60"/>
+              <w:left w:type="dxa" w:w="90"/>
+              <w:bottom w:type="dxa" w:w="60"/>
+              <w:right w:type="dxa" w:w="90"/>
+            </w:tcMar>
+          </w:tcPr>
+          <w:p>
+            <w:pPr>
+              <w:spacing w:after="0" w:line="240"/>
+            </w:pPr>
+            <w:r>
+              <w:rPr>
+                <w:sz w:val="18"/>
+                <w:szCs w:val="18"/>
+              </w:rPr>
+              <w:t xml:space="preserve">1,900</w:t>
+            </w:r>
+          </w:p>
+        </w:tc>
+        <w:tc>
+          <w:tcPr>
+            <w:tcW w:type="dxa" w:w="1000"/>
+            <w:tcMar>
+              <w:top w:type="dxa" w:w="60"/>
+              <w:left w:type="dxa" w:w="90"/>
+              <w:bottom w:type="dxa" w:w="60"/>
+              <w:right w:type="dxa" w:w="90"/>
+            </w:tcMar>
+          </w:tcPr>
+          <w:p>
+            <w:pPr>
+              <w:spacing w:after="0" w:line="240"/>
+            </w:pPr>
+            <w:r>
+              <w:rPr>
+                <w:sz w:val="18"/>
+                <w:szCs w:val="18"/>
+              </w:rPr>
+              <w:t xml:space="preserve">3,916</w:t>
+            </w:r>
+          </w:p>
+        </w:tc>
+        <w:tc>
+          <w:tcPr>
+            <w:tcW w:type="dxa" w:w="1100"/>
+            <w:tcMar>
+              <w:top w:type="dxa" w:w="60"/>
+              <w:left w:type="dxa" w:w="90"/>
+              <w:bottom w:type="dxa" w:w="60"/>
+              <w:right w:type="dxa" w:w="90"/>
+            </w:tcMar>
+          </w:tcPr>
+          <w:p>
+            <w:pPr>
+              <w:spacing w:after="0" w:line="240"/>
+            </w:pPr>
+            <w:r>
+              <w:rPr>
+                <w:sz w:val="18"/>
+                <w:szCs w:val="18"/>
+              </w:rPr>
+              <w:t xml:space="preserve">0.00232</w:t>
+            </w:r>
+          </w:p>
+        </w:tc>
+        <w:tc>
+          <w:tcPr>
+            <w:tcW w:type="dxa" w:w="1000"/>
+            <w:tcMar>
+              <w:top w:type="dxa" w:w="60"/>
+              <w:left w:type="dxa" w:w="90"/>
+              <w:bottom w:type="dxa" w:w="60"/>
+              <w:right w:type="dxa" w:w="90"/>
+            </w:tcMar>
+          </w:tcPr>
+          <w:p>
+            <w:pPr>
+              <w:spacing w:after="0" w:line="240"/>
+            </w:pPr>
+            <w:r>
+              <w:rPr>
+                <w:sz w:val="18"/>
+                <w:szCs w:val="18"/>
+              </w:rPr>
+              <w:t xml:space="preserve">0.427</w:t>
+            </w:r>
+          </w:p>
+        </w:tc>
+        <w:tc>
+          <w:tcPr>
+            <w:tcW w:type="dxa" w:w="1000"/>
+            <w:tcMar>
+              <w:top w:type="dxa" w:w="60"/>
+              <w:left w:type="dxa" w:w="90"/>
+              <w:bottom w:type="dxa" w:w="60"/>
+              <w:right w:type="dxa" w:w="90"/>
+            </w:tcMar>
+          </w:tcPr>
+          <w:p>
+            <w:pPr>
+              <w:spacing w:after="0" w:line="240"/>
+            </w:pPr>
+            <w:r>
+              <w:rPr>
+                <w:sz w:val="18"/>
+                <w:szCs w:val="18"/>
+              </w:rPr>
+              <w:t xml:space="preserve">0.0252</w:t>
+            </w:r>
+          </w:p>
+        </w:tc>
+        <w:tc>
+          <w:tcPr>
+            <w:tcW w:type="dxa" w:w="900"/>
+            <w:tcMar>
+              <w:top w:type="dxa" w:w="60"/>
+              <w:left w:type="dxa" w:w="90"/>
+              <w:bottom w:type="dxa" w:w="60"/>
+              <w:right w:type="dxa" w:w="90"/>
+            </w:tcMar>
+          </w:tcPr>
+          <w:p>
+            <w:pPr>
+              <w:spacing w:after="0" w:line="240"/>
+            </w:pPr>
+            <w:r>
+              <w:rPr>
+                <w:sz w:val="18"/>
+                <w:szCs w:val="18"/>
+              </w:rPr>
+              <w:t xml:space="preserve">Yes</w:t>
+            </w:r>
+          </w:p>
+        </w:tc>
+      </w:tr>
+      <w:tr>
+        <w:tc>
+          <w:tcPr>
+            <w:tcW w:type="dxa" w:w="2600"/>
+            <w:tcMar>
+              <w:top w:type="dxa" w:w="60"/>
+              <w:left w:type="dxa" w:w="90"/>
+              <w:bottom w:type="dxa" w:w="60"/>
+              <w:right w:type="dxa" w:w="90"/>
+            </w:tcMar>
+          </w:tcPr>
+          <w:p>
+            <w:pPr>
+              <w:spacing w:after="0" w:line="240"/>
+            </w:pPr>
+            <w:r>
+              <w:rPr>
+                <w:sz w:val="18"/>
+                <w:szCs w:val="18"/>
+              </w:rPr>
+              <w:t xml:space="preserve">F</w:t>
+            </w:r>
+            <w:r>
+              <w:rPr>
+                <w:sz w:val="18"/>
+                <w:szCs w:val="18"/>
+                <w:vertAlign w:val="subscript"/>
+              </w:rPr>
+              <w:t xml:space="preserve">ws</w:t>
+            </w:r>
+            <w:r>
+              <w:rPr>
+                <w:sz w:val="18"/>
+                <w:szCs w:val="18"/>
+              </w:rPr>
+              <w:t xml:space="preserve"> ≥ 0.90</w:t>
+            </w:r>
+          </w:p>
+        </w:tc>
+        <w:tc>
+          <w:tcPr>
+            <w:tcW w:type="dxa" w:w="1000"/>
+            <w:tcMar>
+              <w:top w:type="dxa" w:w="60"/>
+              <w:left w:type="dxa" w:w="90"/>
+              <w:bottom w:type="dxa" w:w="60"/>
+              <w:right w:type="dxa" w:w="90"/>
+            </w:tcMar>
+          </w:tcPr>
+          <w:p>
+            <w:pPr>
+              <w:spacing w:after="0" w:line="240"/>
+            </w:pPr>
+            <w:r>
+              <w:rPr>
+                <w:sz w:val="18"/>
+                <w:szCs w:val="18"/>
+              </w:rPr>
+              <w:t xml:space="preserve">2,196</w:t>
+            </w:r>
+          </w:p>
+        </w:tc>
+        <w:tc>
+          <w:tcPr>
+            <w:tcW w:type="dxa" w:w="1000"/>
+            <w:tcMar>
+              <w:top w:type="dxa" w:w="60"/>
+              <w:left w:type="dxa" w:w="90"/>
+              <w:bottom w:type="dxa" w:w="60"/>
+              <w:right w:type="dxa" w:w="90"/>
+            </w:tcMar>
+          </w:tcPr>
+          <w:p>
+            <w:pPr>
+              <w:spacing w:after="0" w:line="240"/>
+            </w:pPr>
+            <w:r>
+              <w:rPr>
+                <w:sz w:val="18"/>
+                <w:szCs w:val="18"/>
+              </w:rPr>
+              <w:t xml:space="preserve">3,629</w:t>
+            </w:r>
+          </w:p>
+        </w:tc>
+        <w:tc>
+          <w:tcPr>
+            <w:tcW w:type="dxa" w:w="1100"/>
+            <w:tcMar>
+              <w:top w:type="dxa" w:w="60"/>
+              <w:left w:type="dxa" w:w="90"/>
+              <w:bottom w:type="dxa" w:w="60"/>
+              <w:right w:type="dxa" w:w="90"/>
+            </w:tcMar>
+          </w:tcPr>
+          <w:p>
+            <w:pPr>
+              <w:spacing w:after="0" w:line="240"/>
+            </w:pPr>
+            <w:r>
+              <w:rPr>
+                <w:sz w:val="18"/>
+                <w:szCs w:val="18"/>
+              </w:rPr>
+              <w:t xml:space="preserve">0.00240</w:t>
+            </w:r>
+          </w:p>
+        </w:tc>
+        <w:tc>
+          <w:tcPr>
+            <w:tcW w:type="dxa" w:w="1000"/>
+            <w:tcMar>
+              <w:top w:type="dxa" w:w="60"/>
+              <w:left w:type="dxa" w:w="90"/>
+              <w:bottom w:type="dxa" w:w="60"/>
+              <w:right w:type="dxa" w:w="90"/>
+            </w:tcMar>
+          </w:tcPr>
+          <w:p>
+            <w:pPr>
+              <w:spacing w:after="0" w:line="240"/>
+            </w:pPr>
+            <w:r>
+              <w:rPr>
+                <w:sz w:val="18"/>
+                <w:szCs w:val="18"/>
+              </w:rPr>
+              <w:t xml:space="preserve">0.318</w:t>
+            </w:r>
+          </w:p>
+        </w:tc>
+        <w:tc>
+          <w:tcPr>
+            <w:tcW w:type="dxa" w:w="1000"/>
+            <w:tcMar>
+              <w:top w:type="dxa" w:w="60"/>
+              <w:left w:type="dxa" w:w="90"/>
+              <w:bottom w:type="dxa" w:w="60"/>
+              <w:right w:type="dxa" w:w="90"/>
+            </w:tcMar>
+          </w:tcPr>
+          <w:p>
+            <w:pPr>
+              <w:spacing w:after="0" w:line="240"/>
+            </w:pPr>
+            <w:r>
+              <w:rPr>
+                <w:sz w:val="18"/>
+                <w:szCs w:val="18"/>
+              </w:rPr>
+              <w:t xml:space="preserve">0.0874</w:t>
+            </w:r>
+          </w:p>
+        </w:tc>
+        <w:tc>
+          <w:tcPr>
+            <w:tcW w:type="dxa" w:w="900"/>
+            <w:tcMar>
+              <w:top w:type="dxa" w:w="60"/>
+              <w:left w:type="dxa" w:w="90"/>
+              <w:bottom w:type="dxa" w:w="60"/>
+              <w:right w:type="dxa" w:w="90"/>
+            </w:tcMar>
+          </w:tcPr>
+          <w:p>
+            <w:pPr>
+              <w:spacing w:after="0" w:line="240"/>
+            </w:pPr>
+            <w:r>
+              <w:rPr>
+                <w:sz w:val="18"/>
+                <w:szCs w:val="18"/>
+              </w:rPr>
+              <w:t xml:space="preserve">No</w:t>
+            </w:r>
+          </w:p>
+        </w:tc>
+      </w:tr>
+      <w:tr>
+        <w:tc>
+          <w:tcPr>
+            <w:tcW w:type="dxa" w:w="2600"/>
+            <w:tcMar>
+              <w:top w:type="dxa" w:w="60"/>
+              <w:left w:type="dxa" w:w="90"/>
+              <w:bottom w:type="dxa" w:w="60"/>
+              <w:right w:type="dxa" w:w="90"/>
+            </w:tcMar>
+          </w:tcPr>
+          <w:p>
+            <w:pPr>
+              <w:spacing w:after="0" w:line="240"/>
+            </w:pPr>
+            <w:r>
+              <w:rPr>
+                <w:sz w:val="18"/>
+                <w:szCs w:val="18"/>
+              </w:rPr>
+              <w:t xml:space="preserve">F</w:t>
+            </w:r>
+            <w:r>
+              <w:rPr>
+                <w:sz w:val="18"/>
+                <w:szCs w:val="18"/>
+                <w:vertAlign w:val="subscript"/>
+              </w:rPr>
+              <w:t xml:space="preserve">ws</w:t>
+            </w:r>
+            <w:r>
+              <w:rPr>
+                <w:sz w:val="18"/>
+                <w:szCs w:val="18"/>
+              </w:rPr>
+              <w:t xml:space="preserve"> ≥ 0.80</w:t>
+            </w:r>
+          </w:p>
+        </w:tc>
+        <w:tc>
+          <w:tcPr>
+            <w:tcW w:type="dxa" w:w="1000"/>
+            <w:tcMar>
+              <w:top w:type="dxa" w:w="60"/>
+              <w:left w:type="dxa" w:w="90"/>
+              <w:bottom w:type="dxa" w:w="60"/>
+              <w:right w:type="dxa" w:w="90"/>
+            </w:tcMar>
+          </w:tcPr>
+          <w:p>
+            <w:pPr>
+              <w:spacing w:after="0" w:line="240"/>
+            </w:pPr>
+            <w:r>
+              <w:rPr>
+                <w:sz w:val="18"/>
+                <w:szCs w:val="18"/>
+              </w:rPr>
+              <w:t xml:space="preserve">2,746</w:t>
+            </w:r>
+          </w:p>
+        </w:tc>
+        <w:tc>
+          <w:tcPr>
+            <w:tcW w:type="dxa" w:w="1000"/>
+            <w:tcMar>
+              <w:top w:type="dxa" w:w="60"/>
+              <w:left w:type="dxa" w:w="90"/>
+              <w:bottom w:type="dxa" w:w="60"/>
+              <w:right w:type="dxa" w:w="90"/>
+            </w:tcMar>
+          </w:tcPr>
+          <w:p>
+            <w:pPr>
+              <w:spacing w:after="0" w:line="240"/>
+            </w:pPr>
+            <w:r>
+              <w:rPr>
+                <w:sz w:val="18"/>
+                <w:szCs w:val="18"/>
+              </w:rPr>
+              <w:t xml:space="preserve">3,496</w:t>
+            </w:r>
+          </w:p>
+        </w:tc>
+        <w:tc>
+          <w:tcPr>
+            <w:tcW w:type="dxa" w:w="1100"/>
+            <w:tcMar>
+              <w:top w:type="dxa" w:w="60"/>
+              <w:left w:type="dxa" w:w="90"/>
+              <w:bottom w:type="dxa" w:w="60"/>
+              <w:right w:type="dxa" w:w="90"/>
+            </w:tcMar>
+          </w:tcPr>
+          <w:p>
+            <w:pPr>
+              <w:spacing w:after="0" w:line="240"/>
+            </w:pPr>
+            <w:r>
+              <w:rPr>
+                <w:sz w:val="18"/>
+                <w:szCs w:val="18"/>
+              </w:rPr>
+              <w:t xml:space="preserve">0.00255</w:t>
+            </w:r>
+          </w:p>
+        </w:tc>
+        <w:tc>
+          <w:tcPr>
+            <w:tcW w:type="dxa" w:w="1000"/>
+            <w:tcMar>
+              <w:top w:type="dxa" w:w="60"/>
+              <w:left w:type="dxa" w:w="90"/>
+              <w:bottom w:type="dxa" w:w="60"/>
+              <w:right w:type="dxa" w:w="90"/>
+            </w:tcMar>
+          </w:tcPr>
+          <w:p>
+            <w:pPr>
+              <w:spacing w:after="0" w:line="240"/>
+            </w:pPr>
+            <w:r>
+              <w:rPr>
+                <w:sz w:val="18"/>
+                <w:szCs w:val="18"/>
+              </w:rPr>
+              <w:t xml:space="preserve">0.256</w:t>
+            </w:r>
+          </w:p>
+        </w:tc>
+        <w:tc>
+          <w:tcPr>
+            <w:tcW w:type="dxa" w:w="1000"/>
+            <w:tcMar>
+              <w:top w:type="dxa" w:w="60"/>
+              <w:left w:type="dxa" w:w="90"/>
+              <w:bottom w:type="dxa" w:w="60"/>
+              <w:right w:type="dxa" w:w="90"/>
+            </w:tcMar>
+          </w:tcPr>
+          <w:p>
+            <w:pPr>
+              <w:spacing w:after="0" w:line="240"/>
+            </w:pPr>
+            <w:r>
+              <w:rPr>
+                <w:sz w:val="18"/>
+                <w:szCs w:val="18"/>
+              </w:rPr>
+              <w:t xml:space="preserve">0.1687</w:t>
+            </w:r>
+          </w:p>
+        </w:tc>
+        <w:tc>
+          <w:tcPr>
+            <w:tcW w:type="dxa" w:w="900"/>
+            <w:tcMar>
+              <w:top w:type="dxa" w:w="60"/>
+              <w:left w:type="dxa" w:w="90"/>
+              <w:bottom w:type="dxa" w:w="60"/>
+              <w:right w:type="dxa" w:w="90"/>
+            </w:tcMar>
+          </w:tcPr>
+          <w:p>
+            <w:pPr>
+              <w:spacing w:after="0" w:line="240"/>
+            </w:pPr>
+            <w:r>
+              <w:rPr>
+                <w:sz w:val="18"/>
+                <w:szCs w:val="18"/>
+              </w:rPr>
+              <w:t xml:space="preserve">No</w:t>
+            </w:r>
+          </w:p>
+        </w:tc>
+      </w:tr>
+      <w:tr>
+        <w:tc>
+          <w:tcPr>
+            <w:tcW w:type="dxa" w:w="2600"/>
+            <w:tcMar>
+              <w:top w:type="dxa" w:w="60"/>
+              <w:left w:type="dxa" w:w="90"/>
+              <w:bottom w:type="dxa" w:w="60"/>
+              <w:right w:type="dxa" w:w="90"/>
+            </w:tcMar>
+          </w:tcPr>
+          <w:p>
+            <w:pPr>
+              <w:spacing w:after="0" w:line="240"/>
+            </w:pPr>
+            <w:r>
+              <w:rPr>
+                <w:sz w:val="18"/>
+                <w:szCs w:val="18"/>
+              </w:rPr>
+              <w:t xml:space="preserve">No F</w:t>
+            </w:r>
+            <w:r>
+              <w:rPr>
+                <w:sz w:val="18"/>
+                <w:szCs w:val="18"/>
+                <w:vertAlign w:val="subscript"/>
+              </w:rPr>
+              <w:t xml:space="preserve">ws</w:t>
+            </w:r>
+            <w:r>
+              <w:rPr>
+                <w:sz w:val="18"/>
+                <w:szCs w:val="18"/>
+              </w:rPr>
+              <w:t xml:space="preserve"> filter</w:t>
+            </w:r>
+          </w:p>
+        </w:tc>
+        <w:tc>
+          <w:tcPr>
+            <w:tcW w:type="dxa" w:w="1000"/>
+            <w:tcMar>
+              <w:top w:type="dxa" w:w="60"/>
+              <w:left w:type="dxa" w:w="90"/>
+              <w:bottom w:type="dxa" w:w="60"/>
+              <w:right w:type="dxa" w:w="90"/>
+            </w:tcMar>
+          </w:tcPr>
+          <w:p>
+            <w:pPr>
+              <w:spacing w:after="0" w:line="240"/>
+            </w:pPr>
+            <w:r>
+              <w:rPr>
+                <w:sz w:val="18"/>
+                <w:szCs w:val="18"/>
+              </w:rPr>
+              <w:t xml:space="preserve">4,403</w:t>
+            </w:r>
+          </w:p>
+        </w:tc>
+        <w:tc>
+          <w:tcPr>
+            <w:tcW w:type="dxa" w:w="1000"/>
+            <w:tcMar>
+              <w:top w:type="dxa" w:w="60"/>
+              <w:left w:type="dxa" w:w="90"/>
+              <w:bottom w:type="dxa" w:w="60"/>
+              <w:right w:type="dxa" w:w="90"/>
+            </w:tcMar>
+          </w:tcPr>
+          <w:p>
+            <w:pPr>
+              <w:spacing w:after="0" w:line="240"/>
+            </w:pPr>
+            <w:r>
+              <w:rPr>
+                <w:sz w:val="18"/>
+                <w:szCs w:val="18"/>
+              </w:rPr>
+              <w:t xml:space="preserve">3,275</w:t>
+            </w:r>
+          </w:p>
+        </w:tc>
+        <w:tc>
+          <w:tcPr>
+            <w:tcW w:type="dxa" w:w="1100"/>
+            <w:tcMar>
+              <w:top w:type="dxa" w:w="60"/>
+              <w:left w:type="dxa" w:w="90"/>
+              <w:bottom w:type="dxa" w:w="60"/>
+              <w:right w:type="dxa" w:w="90"/>
+            </w:tcMar>
+          </w:tcPr>
+          <w:p>
+            <w:pPr>
+              <w:spacing w:after="0" w:line="240"/>
+            </w:pPr>
+            <w:r>
+              <w:rPr>
+                <w:sz w:val="18"/>
+                <w:szCs w:val="18"/>
+              </w:rPr>
+              <w:t xml:space="preserve">0.00254</w:t>
+            </w:r>
+          </w:p>
+        </w:tc>
+        <w:tc>
+          <w:tcPr>
+            <w:tcW w:type="dxa" w:w="1000"/>
+            <w:tcMar>
+              <w:top w:type="dxa" w:w="60"/>
+              <w:left w:type="dxa" w:w="90"/>
+              <w:bottom w:type="dxa" w:w="60"/>
+              <w:right w:type="dxa" w:w="90"/>
+            </w:tcMar>
+          </w:tcPr>
+          <w:p>
+            <w:pPr>
+              <w:spacing w:after="0" w:line="240"/>
+            </w:pPr>
+            <w:r>
+              <w:rPr>
+                <w:sz w:val="18"/>
+                <w:szCs w:val="18"/>
+              </w:rPr>
+              <w:t xml:space="preserve">0.245</w:t>
+            </w:r>
+          </w:p>
+        </w:tc>
+        <w:tc>
+          <w:tcPr>
+            <w:tcW w:type="dxa" w:w="1000"/>
+            <w:tcMar>
+              <w:top w:type="dxa" w:w="60"/>
+              <w:left w:type="dxa" w:w="90"/>
+              <w:bottom w:type="dxa" w:w="60"/>
+              <w:right w:type="dxa" w:w="90"/>
+            </w:tcMar>
+          </w:tcPr>
+          <w:p>
+            <w:pPr>
+              <w:spacing w:after="0" w:line="240"/>
+            </w:pPr>
+            <w:r>
+              <w:rPr>
+                <w:sz w:val="18"/>
+                <w:szCs w:val="18"/>
+              </w:rPr>
+              <w:t xml:space="preserve">0.1792</w:t>
+            </w:r>
+          </w:p>
+        </w:tc>
+        <w:tc>
+          <w:tcPr>
+            <w:tcW w:type="dxa" w:w="900"/>
+            <w:tcMar>
+              <w:top w:type="dxa" w:w="60"/>
+              <w:left w:type="dxa" w:w="90"/>
+              <w:bottom w:type="dxa" w:w="60"/>
+              <w:right w:type="dxa" w:w="90"/>
+            </w:tcMar>
+          </w:tcPr>
+          <w:p>
+            <w:pPr>
+              <w:spacing w:after="0" w:line="240"/>
+            </w:pPr>
+            <w:r>
+              <w:rPr>
+                <w:sz w:val="18"/>
+                <w:szCs w:val="18"/>
+              </w:rPr>
+              <w:t xml:space="preserve">No</w:t>
+            </w:r>
+          </w:p>
+        </w:tc>
+      </w:tr>
+      <w:tr>
+        <w:tc>
+          <w:tcPr>
+            <w:tcW w:type="dxa" w:w="2600"/>
+            <w:tcMar>
+              <w:top w:type="dxa" w:w="60"/>
+              <w:left w:type="dxa" w:w="90"/>
+              <w:bottom w:type="dxa" w:w="60"/>
+              <w:right w:type="dxa" w:w="90"/>
+            </w:tcMar>
+          </w:tcPr>
+          <w:p>
+            <w:pPr>
+              <w:spacing w:after="0" w:line="240"/>
+            </w:pPr>
+            <w:r>
+              <w:rPr>
+                <w:sz w:val="18"/>
+                <w:szCs w:val="18"/>
+              </w:rPr>
+              <w:t xml:space="preserve">MAF ≥ 0.01</w:t>
+            </w:r>
+          </w:p>
+        </w:tc>
+        <w:tc>
+          <w:tcPr>
+            <w:tcW w:type="dxa" w:w="1000"/>
+            <w:tcMar>
+              <w:top w:type="dxa" w:w="60"/>
+              <w:left w:type="dxa" w:w="90"/>
+              <w:bottom w:type="dxa" w:w="60"/>
+              <w:right w:type="dxa" w:w="90"/>
+            </w:tcMar>
+          </w:tcPr>
+          <w:p>
+            <w:pPr>
+              <w:spacing w:after="0" w:line="240"/>
+            </w:pPr>
+            <w:r>
+              <w:rPr>
+                <w:sz w:val="18"/>
+                <w:szCs w:val="18"/>
+              </w:rPr>
+              <w:t xml:space="preserve">1,900</w:t>
+            </w:r>
+          </w:p>
+        </w:tc>
+        <w:tc>
+          <w:tcPr>
+            <w:tcW w:type="dxa" w:w="1000"/>
+            <w:tcMar>
+              <w:top w:type="dxa" w:w="60"/>
+              <w:left w:type="dxa" w:w="90"/>
+              <w:bottom w:type="dxa" w:w="60"/>
+              <w:right w:type="dxa" w:w="90"/>
+            </w:tcMar>
+          </w:tcPr>
+          <w:p>
+            <w:pPr>
+              <w:spacing w:after="0" w:line="240"/>
+            </w:pPr>
+            <w:r>
+              <w:rPr>
+                <w:sz w:val="18"/>
+                <w:szCs w:val="18"/>
+              </w:rPr>
+              <w:t xml:space="preserve">10,876</w:t>
+            </w:r>
+          </w:p>
+        </w:tc>
+        <w:tc>
+          <w:tcPr>
+            <w:tcW w:type="dxa" w:w="1100"/>
+            <w:tcMar>
+              <w:top w:type="dxa" w:w="60"/>
+              <w:left w:type="dxa" w:w="90"/>
+              <w:bottom w:type="dxa" w:w="60"/>
+              <w:right w:type="dxa" w:w="90"/>
+            </w:tcMar>
+          </w:tcPr>
+          <w:p>
+            <w:pPr>
+              <w:spacing w:after="0" w:line="240"/>
+            </w:pPr>
+            <w:r>
+              <w:rPr>
+                <w:sz w:val="18"/>
+                <w:szCs w:val="18"/>
+              </w:rPr>
+              <w:t xml:space="preserve">0.00204</w:t>
+            </w:r>
+          </w:p>
+        </w:tc>
+        <w:tc>
+          <w:tcPr>
+            <w:tcW w:type="dxa" w:w="1000"/>
+            <w:tcMar>
+              <w:top w:type="dxa" w:w="60"/>
+              <w:left w:type="dxa" w:w="90"/>
+              <w:bottom w:type="dxa" w:w="60"/>
+              <w:right w:type="dxa" w:w="90"/>
+            </w:tcMar>
+          </w:tcPr>
+          <w:p>
+            <w:pPr>
+              <w:spacing w:after="0" w:line="240"/>
+            </w:pPr>
+            <w:r>
+              <w:rPr>
+                <w:sz w:val="18"/>
+                <w:szCs w:val="18"/>
+              </w:rPr>
+              <w:t xml:space="preserve">0.432</w:t>
+            </w:r>
+          </w:p>
+        </w:tc>
+        <w:tc>
+          <w:tcPr>
+            <w:tcW w:type="dxa" w:w="1000"/>
+            <w:tcMar>
+              <w:top w:type="dxa" w:w="60"/>
+              <w:left w:type="dxa" w:w="90"/>
+              <w:bottom w:type="dxa" w:w="60"/>
+              <w:right w:type="dxa" w:w="90"/>
+            </w:tcMar>
+          </w:tcPr>
+          <w:p>
+            <w:pPr>
+              <w:spacing w:after="0" w:line="240"/>
+            </w:pPr>
+            <w:r>
+              <w:rPr>
+                <w:sz w:val="18"/>
+                <w:szCs w:val="18"/>
+              </w:rPr>
+              <w:t xml:space="preserve">0.0617</w:t>
+            </w:r>
+          </w:p>
+        </w:tc>
+        <w:tc>
+          <w:tcPr>
+            <w:tcW w:type="dxa" w:w="900"/>
+            <w:tcMar>
+              <w:top w:type="dxa" w:w="60"/>
+              <w:left w:type="dxa" w:w="90"/>
+              <w:bottom w:type="dxa" w:w="60"/>
+              <w:right w:type="dxa" w:w="90"/>
+            </w:tcMar>
+          </w:tcPr>
+          <w:p>
+            <w:pPr>
+              <w:spacing w:after="0" w:line="240"/>
+            </w:pPr>
+            <w:r>
+              <w:rPr>
+                <w:sz w:val="18"/>
+                <w:szCs w:val="18"/>
+              </w:rPr>
+              <w:t xml:space="preserve">No</w:t>
+            </w:r>
+          </w:p>
+        </w:tc>
+      </w:tr>
+      <w:tr>
+        <w:tc>
+          <w:tcPr>
+            <w:tcW w:type="dxa" w:w="2600"/>
+            <w:tcMar>
+              <w:top w:type="dxa" w:w="60"/>
+              <w:left w:type="dxa" w:w="90"/>
+              <w:bottom w:type="dxa" w:w="60"/>
+              <w:right w:type="dxa" w:w="90"/>
+            </w:tcMar>
+          </w:tcPr>
+          <w:p>
+            <w:pPr>
+              <w:spacing w:after="0" w:line="240"/>
+            </w:pPr>
+            <w:r>
+              <w:rPr>
+                <w:sz w:val="18"/>
+                <w:szCs w:val="18"/>
+              </w:rPr>
+              <w:t xml:space="preserve">MAF ≥ 0.02</w:t>
+            </w:r>
+          </w:p>
+        </w:tc>
+        <w:tc>
+          <w:tcPr>
+            <w:tcW w:type="dxa" w:w="1000"/>
+            <w:tcMar>
+              <w:top w:type="dxa" w:w="60"/>
+              <w:left w:type="dxa" w:w="90"/>
+              <w:bottom w:type="dxa" w:w="60"/>
+              <w:right w:type="dxa" w:w="90"/>
+            </w:tcMar>
+          </w:tcPr>
+          <w:p>
+            <w:pPr>
+              <w:spacing w:after="0" w:line="240"/>
+            </w:pPr>
+            <w:r>
+              <w:rPr>
+                <w:sz w:val="18"/>
+                <w:szCs w:val="18"/>
+              </w:rPr>
+              <w:t xml:space="preserve">1,900</w:t>
+            </w:r>
+          </w:p>
+        </w:tc>
+        <w:tc>
+          <w:tcPr>
+            <w:tcW w:type="dxa" w:w="1000"/>
+            <w:tcMar>
+              <w:top w:type="dxa" w:w="60"/>
+              <w:left w:type="dxa" w:w="90"/>
+              <w:bottom w:type="dxa" w:w="60"/>
+              <w:right w:type="dxa" w:w="90"/>
+            </w:tcMar>
+          </w:tcPr>
+          <w:p>
+            <w:pPr>
+              <w:spacing w:after="0" w:line="240"/>
+            </w:pPr>
+            <w:r>
+              <w:rPr>
+                <w:sz w:val="18"/>
+                <w:szCs w:val="18"/>
+              </w:rPr>
+              <w:t xml:space="preserve">6,852</w:t>
+            </w:r>
+          </w:p>
+        </w:tc>
+        <w:tc>
+          <w:tcPr>
+            <w:tcW w:type="dxa" w:w="1100"/>
+            <w:tcMar>
+              <w:top w:type="dxa" w:w="60"/>
+              <w:left w:type="dxa" w:w="90"/>
+              <w:bottom w:type="dxa" w:w="60"/>
+              <w:right w:type="dxa" w:w="90"/>
+            </w:tcMar>
+          </w:tcPr>
+          <w:p>
+            <w:pPr>
+              <w:spacing w:after="0" w:line="240"/>
+            </w:pPr>
+            <w:r>
+              <w:rPr>
+                <w:sz w:val="18"/>
+                <w:szCs w:val="18"/>
+              </w:rPr>
+              <w:t xml:space="preserve">0.00217</w:t>
+            </w:r>
+          </w:p>
+        </w:tc>
+        <w:tc>
+          <w:tcPr>
+            <w:tcW w:type="dxa" w:w="1000"/>
+            <w:tcMar>
+              <w:top w:type="dxa" w:w="60"/>
+              <w:left w:type="dxa" w:w="90"/>
+              <w:bottom w:type="dxa" w:w="60"/>
+              <w:right w:type="dxa" w:w="90"/>
+            </w:tcMar>
+          </w:tcPr>
+          <w:p>
+            <w:pPr>
+              <w:spacing w:after="0" w:line="240"/>
+            </w:pPr>
+            <w:r>
+              <w:rPr>
+                <w:sz w:val="18"/>
+                <w:szCs w:val="18"/>
+              </w:rPr>
+              <w:t xml:space="preserve">0.434</w:t>
+            </w:r>
+          </w:p>
+        </w:tc>
+        <w:tc>
+          <w:tcPr>
+            <w:tcW w:type="dxa" w:w="1000"/>
+            <w:tcMar>
+              <w:top w:type="dxa" w:w="60"/>
+              <w:left w:type="dxa" w:w="90"/>
+              <w:bottom w:type="dxa" w:w="60"/>
+              <w:right w:type="dxa" w:w="90"/>
+            </w:tcMar>
+          </w:tcPr>
+          <w:p>
+            <w:pPr>
+              <w:spacing w:after="0" w:line="240"/>
+            </w:pPr>
+            <w:r>
+              <w:rPr>
+                <w:sz w:val="18"/>
+                <w:szCs w:val="18"/>
+              </w:rPr>
+              <w:t xml:space="preserve">0.0467</w:t>
+            </w:r>
+          </w:p>
+        </w:tc>
+        <w:tc>
+          <w:tcPr>
+            <w:tcW w:type="dxa" w:w="900"/>
+            <w:tcMar>
+              <w:top w:type="dxa" w:w="60"/>
+              <w:left w:type="dxa" w:w="90"/>
+              <w:bottom w:type="dxa" w:w="60"/>
+              <w:right w:type="dxa" w:w="90"/>
+            </w:tcMar>
+          </w:tcPr>
+          <w:p>
+            <w:pPr>
+              <w:spacing w:after="0" w:line="240"/>
+            </w:pPr>
+            <w:r>
+              <w:rPr>
+                <w:sz w:val="18"/>
+                <w:szCs w:val="18"/>
+              </w:rPr>
+              <w:t xml:space="preserve">Yes</w:t>
+            </w:r>
+          </w:p>
+        </w:tc>
+      </w:tr>
+    </w:tbl>
+    <w:p>
+      <w:pPr>
+        <w:spacing w:after="200" w:line="276"/>
+      </w:pPr>
     </w:p>
     <w:p>
       <w:pPr>

</xml_diff>